<commit_message>
Wire final art: S3 (opener, thicket, meadow, ironroot), S4 (Havenmoor opener, hearth, stream + reflow fixes)
Co-Authored-By: Claude Opus 4.8 <noreply@anthropic.com>
</commit_message>
<xml_diff>
--- a/sessions/session_03_quest_for_knowledge.docx
+++ b/sessions/session_03_quest_for_knowledge.docx
@@ -255,86 +255,13 @@
     <w:p>
       <w:pPr>
         <w:keepNext/>
-        <w:spacing w:before="400" w:after="120"/>
-        <w:pBdr>
-          <w:bottom w:val="single" w:sz="6" w:space="4" w:color="B8860B"/>
-        </w:pBdr>
-      </w:pPr>
-      <w:r>
-        <w:rPr>
-          <w:rFonts w:ascii="Georgia" w:hAnsi="Georgia" w:cs="Georgia"/>
-          <w:b/>
-          <w:color w:val="B8860B"/>
-          <w:sz w:val="32"/>
-        </w:rPr>
-        <w:t>Part One: A Morning of Marvels</w:t>
-      </w:r>
-    </w:p>
-    <w:p>
-      <w:pPr>
-        <w:spacing w:before="120" w:after="200"/>
-      </w:pPr>
-      <w:r>
-        <w:rPr>
-          <w:rFonts w:ascii="Georgia" w:hAnsi="Georgia" w:cs="Georgia"/>
-          <w:b w:val="0"/>
-          <w:i/>
-          <w:color w:val="222222"/>
-          <w:sz w:val="21"/>
-        </w:rPr>
-        <w:t>The heroes woke on their first morning at Ravenstone Laboratory, in a tower where magic and science share every shelf.</w:t>
-      </w:r>
-    </w:p>
-    <w:p>
-      <w:pPr>
-        <w:pBdr>
-          <w:left w:val="single" w:sz="18" w:space="12" w:color="B8860B"/>
-        </w:pBdr>
-        <w:shd w:val="clear" w:color="auto" w:fill="FBF6EA"/>
-        <w:spacing w:before="30" w:after="70"/>
-        <w:ind w:left="340" w:right="340"/>
-      </w:pPr>
-      <w:r>
-        <w:rPr>
-          <w:rFonts w:ascii="Georgia" w:hAnsi="Georgia" w:cs="Georgia"/>
-          <w:b w:val="0"/>
-          <w:i w:val="0"/>
-          <w:color w:val="222222"/>
-          <w:sz w:val="21"/>
-        </w:rPr>
-        <w:t xml:space="preserve">Morning sun filters through the high, arched windows of </w:t>
-      </w:r>
-      <w:r>
-        <w:rPr>
-          <w:rFonts w:ascii="Georgia" w:hAnsi="Georgia" w:cs="Georgia"/>
-          <w:b/>
-          <w:i w:val="0"/>
-          <w:color w:val="222222"/>
-          <w:sz w:val="21"/>
-        </w:rPr>
-        <w:t>Ravenstone Laboratory</w:t>
-      </w:r>
-      <w:r>
-        <w:rPr>
-          <w:rFonts w:ascii="Georgia" w:hAnsi="Georgia" w:cs="Georgia"/>
-          <w:b w:val="0"/>
-          <w:i w:val="0"/>
-          <w:color w:val="222222"/>
-          <w:sz w:val="21"/>
-        </w:rPr>
-        <w:t>, laying golden beams across tables cluttered with strange instruments and arcane diagrams. Soft, multicolored lights drift through the air, each one a captured mote of magical essence. Shelves climb the walls, crowded with ancient tomes, glowing crystals, and devices of intricate gears and shimmering runes. Small automatons scurry between the tables carrying tools, and somewhere below, one of the laboratory's remarkable creatures is snoring.</w:t>
-      </w:r>
-    </w:p>
-    <w:p>
-      <w:pPr>
-        <w:keepNext/>
         <w:spacing w:before="120" w:after="40"/>
         <w:jc w:val="center"/>
       </w:pPr>
       <w:r>
         <w:drawing>
           <wp:inline xmlns:a="http://schemas.openxmlformats.org/drawingml/2006/main" xmlns:pic="http://schemas.openxmlformats.org/drawingml/2006/picture">
-            <wp:extent cx="3840480" cy="3840480"/>
+            <wp:extent cx="2651760" cy="2651760"/>
             <wp:docPr id="1" name="Picture 1"/>
             <wp:cNvGraphicFramePr>
               <a:graphicFrameLocks noChangeAspect="1"/>
@@ -355,7 +282,7 @@
                   <pic:spPr>
                     <a:xfrm>
                       <a:off x="0" y="0"/>
-                      <a:ext cx="3840480" cy="3840480"/>
+                      <a:ext cx="2651760" cy="2651760"/>
                     </a:xfrm>
                     <a:prstGeom prst="rect"/>
                   </pic:spPr>
@@ -379,6 +306,79 @@
           <w:sz w:val="18"/>
         </w:rPr>
         <w:t>Ravenstone Laboratory in the morning light.</w:t>
+      </w:r>
+    </w:p>
+    <w:p>
+      <w:pPr>
+        <w:keepNext/>
+        <w:spacing w:before="400" w:after="120"/>
+        <w:pBdr>
+          <w:bottom w:val="single" w:sz="6" w:space="4" w:color="B8860B"/>
+        </w:pBdr>
+      </w:pPr>
+      <w:r>
+        <w:rPr>
+          <w:rFonts w:ascii="Georgia" w:hAnsi="Georgia" w:cs="Georgia"/>
+          <w:b/>
+          <w:color w:val="B8860B"/>
+          <w:sz w:val="32"/>
+        </w:rPr>
+        <w:t>Part One: A Morning of Marvels</w:t>
+      </w:r>
+    </w:p>
+    <w:p>
+      <w:pPr>
+        <w:spacing w:before="120" w:after="200"/>
+      </w:pPr>
+      <w:r>
+        <w:rPr>
+          <w:rFonts w:ascii="Georgia" w:hAnsi="Georgia" w:cs="Georgia"/>
+          <w:b w:val="0"/>
+          <w:i/>
+          <w:color w:val="222222"/>
+          <w:sz w:val="21"/>
+        </w:rPr>
+        <w:t>The heroes woke on their first morning at Ravenstone Laboratory, in a tower where magic and science share every shelf.</w:t>
+      </w:r>
+    </w:p>
+    <w:p>
+      <w:pPr>
+        <w:pBdr>
+          <w:left w:val="single" w:sz="18" w:space="12" w:color="B8860B"/>
+        </w:pBdr>
+        <w:shd w:val="clear" w:color="auto" w:fill="FBF6EA"/>
+        <w:spacing w:before="30" w:after="70"/>
+        <w:ind w:left="340" w:right="340"/>
+      </w:pPr>
+      <w:r>
+        <w:rPr>
+          <w:rFonts w:ascii="Georgia" w:hAnsi="Georgia" w:cs="Georgia"/>
+          <w:b w:val="0"/>
+          <w:i w:val="0"/>
+          <w:color w:val="222222"/>
+          <w:sz w:val="21"/>
+        </w:rPr>
+        <w:t xml:space="preserve">Morning sun filters through the high, arched windows of </w:t>
+      </w:r>
+      <w:r>
+        <w:rPr>
+          <w:rFonts w:ascii="Georgia" w:hAnsi="Georgia" w:cs="Georgia"/>
+          <w:b/>
+          <w:i w:val="0"/>
+          <w:color w:val="222222"/>
+          <w:sz w:val="21"/>
+        </w:rPr>
+        <w:t>Ravenstone Laboratory</w:t>
+      </w:r>
+      <w:r>
+        <w:rPr>
+          <w:rFonts w:ascii="Georgia" w:hAnsi="Georgia" w:cs="Georgia"/>
+          <w:b w:val="0"/>
+          <w:i w:val="0"/>
+          <w:color w:val="222222"/>
+          <w:sz w:val="21"/>
+        </w:rPr>
+        <w:t>, laying golden beams across tables cluttered with strange instruments and arcane diagrams. Soft, multicolored lights drift through the air, each one a captured mote of magical essence. Shelves climb the walls, crowded with ancient tomes, glowing crystals, and devices of intricate gears and shimmering runes. Small automatons scurry between the tables carrying tools, and somewhere below, one of the laboratory's remarkable creatures is snoring.</w:t>
       </w:r>
     </w:p>
     <w:p>
@@ -1784,126 +1784,6 @@
     </w:p>
     <w:p>
       <w:pPr>
-        <w:pBdr>
-          <w:left w:val="single" w:sz="18" w:space="12" w:color="5B2A86"/>
-        </w:pBdr>
-        <w:shd w:val="clear" w:color="auto" w:fill="F4F0FA"/>
-        <w:spacing w:before="30" w:after="70"/>
-        <w:ind w:left="340" w:right="340"/>
-      </w:pPr>
-      <w:r>
-        <w:rPr>
-          <w:rFonts w:ascii="Georgia" w:hAnsi="Georgia" w:cs="Georgia"/>
-          <w:b w:val="0"/>
-          <w:i w:val="0"/>
-          <w:color w:val="222222"/>
-          <w:sz w:val="19"/>
-        </w:rPr>
-        <w:t>▶ Wisdom (Perception) DC 14 to notice the unnatural silence; Intelligence (Arcana) DC 15 to sense necrotic planar energy soaked into the shadows.</w:t>
-      </w:r>
-    </w:p>
-    <w:p>
-      <w:pPr>
-        <w:pBdr>
-          <w:left w:val="single" w:sz="18" w:space="12" w:color="B8860B"/>
-        </w:pBdr>
-        <w:shd w:val="clear" w:color="auto" w:fill="FBF6EA"/>
-        <w:spacing w:before="30" w:after="70"/>
-        <w:ind w:left="340" w:right="340"/>
-      </w:pPr>
-      <w:r>
-        <w:rPr>
-          <w:rFonts w:ascii="Georgia" w:hAnsi="Georgia" w:cs="Georgia"/>
-          <w:b/>
-          <w:i w:val="0"/>
-          <w:color w:val="222222"/>
-          <w:sz w:val="21"/>
-        </w:rPr>
-        <w:t>Ursa</w:t>
-      </w:r>
-      <w:r>
-        <w:rPr>
-          <w:rFonts w:ascii="Georgia" w:hAnsi="Georgia" w:cs="Georgia"/>
-          <w:b w:val="0"/>
-          <w:i w:val="0"/>
-          <w:color w:val="222222"/>
-          <w:sz w:val="21"/>
-        </w:rPr>
-        <w:t>, whispering, his breath misting: “This does not feel right. Something is here. The forest itself feels sick.”</w:t>
-      </w:r>
-    </w:p>
-    <w:p>
-      <w:pPr>
-        <w:pBdr>
-          <w:left w:val="single" w:sz="18" w:space="12" w:color="B8860B"/>
-        </w:pBdr>
-        <w:shd w:val="clear" w:color="auto" w:fill="FBF6EA"/>
-        <w:spacing w:before="30" w:after="70"/>
-        <w:ind w:left="340" w:right="340"/>
-      </w:pPr>
-      <w:r>
-        <w:rPr>
-          <w:rFonts w:ascii="Georgia" w:hAnsi="Georgia" w:cs="Georgia"/>
-          <w:b w:val="0"/>
-          <w:i w:val="0"/>
-          <w:color w:val="222222"/>
-          <w:sz w:val="21"/>
-        </w:rPr>
-        <w:t xml:space="preserve">The mist thickens until the party can see barely twenty feet. The temperature plummets. A hollow laughter echoes through the trees, vibrating up through the ground, and from the swirling shadows two glowing eyes open. A twisted, flickering shape gathers itself out of dark purple flame: a </w:t>
-      </w:r>
-      <w:r>
-        <w:rPr>
-          <w:rFonts w:ascii="Georgia" w:hAnsi="Georgia" w:cs="Georgia"/>
-          <w:b/>
-          <w:i w:val="0"/>
-          <w:color w:val="222222"/>
-          <w:sz w:val="21"/>
-        </w:rPr>
-        <w:t>Shadowflame</w:t>
-      </w:r>
-      <w:r>
-        <w:rPr>
-          <w:rFonts w:ascii="Georgia" w:hAnsi="Georgia" w:cs="Georgia"/>
-          <w:b w:val="0"/>
-          <w:i w:val="0"/>
-          <w:color w:val="222222"/>
-          <w:sz w:val="21"/>
-        </w:rPr>
-        <w:t>, its jagged mouth curled into a grin, wisps of shadow trailing from its limbs like ghostly fire.</w:t>
-      </w:r>
-    </w:p>
-    <w:p>
-      <w:pPr>
-        <w:pBdr>
-          <w:left w:val="single" w:sz="18" w:space="12" w:color="B8860B"/>
-        </w:pBdr>
-        <w:shd w:val="clear" w:color="auto" w:fill="FBF6EA"/>
-        <w:spacing w:before="30" w:after="70"/>
-        <w:ind w:left="340" w:right="340"/>
-      </w:pPr>
-      <w:r>
-        <w:rPr>
-          <w:rFonts w:ascii="Georgia" w:hAnsi="Georgia" w:cs="Georgia"/>
-          <w:b/>
-          <w:i w:val="0"/>
-          <w:color w:val="222222"/>
-          <w:sz w:val="21"/>
-        </w:rPr>
-        <w:t>Shadowflame</w:t>
-      </w:r>
-      <w:r>
-        <w:rPr>
-          <w:rFonts w:ascii="Georgia" w:hAnsi="Georgia" w:cs="Georgia"/>
-          <w:b w:val="0"/>
-          <w:i w:val="0"/>
-          <w:color w:val="222222"/>
-          <w:sz w:val="21"/>
-        </w:rPr>
-        <w:t>, in a whispery, disembodied voice: “Your fears are tasty... let me see them... let me taste them!”</w:t>
-      </w:r>
-    </w:p>
-    <w:p>
-      <w:pPr>
         <w:keepNext/>
         <w:spacing w:before="120" w:after="40"/>
         <w:jc w:val="center"/>
@@ -1911,7 +1791,7 @@
       <w:r>
         <w:drawing>
           <wp:inline xmlns:a="http://schemas.openxmlformats.org/drawingml/2006/main" xmlns:pic="http://schemas.openxmlformats.org/drawingml/2006/picture">
-            <wp:extent cx="3840480" cy="3840480"/>
+            <wp:extent cx="3108960" cy="3108960"/>
             <wp:docPr id="7" name="Picture 7"/>
             <wp:cNvGraphicFramePr>
               <a:graphicFrameLocks noChangeAspect="1"/>
@@ -1932,7 +1812,7 @@
                   <pic:spPr>
                     <a:xfrm>
                       <a:off x="0" y="0"/>
-                      <a:ext cx="3840480" cy="3840480"/>
+                      <a:ext cx="3108960" cy="3108960"/>
                     </a:xfrm>
                     <a:prstGeom prst="rect"/>
                   </pic:spPr>
@@ -1955,7 +1835,7 @@
           <w:color w:val="888888"/>
           <w:sz w:val="18"/>
         </w:rPr>
-        <w:t>The Shadowflame splits into a hall of grinning illusions.</w:t>
+        <w:t>The path into Brambleshadow Thicket, where the birds stop singing.</w:t>
       </w:r>
     </w:p>
     <w:p>
@@ -1975,27 +1855,7 @@
           <w:color w:val="222222"/>
           <w:sz w:val="19"/>
         </w:rPr>
-        <w:t xml:space="preserve">▶ </w:t>
-      </w:r>
-      <w:r>
-        <w:rPr>
-          <w:rFonts w:ascii="Georgia" w:hAnsi="Georgia" w:cs="Georgia"/>
-          <w:b/>
-          <w:i w:val="0"/>
-          <w:color w:val="222222"/>
-          <w:sz w:val="19"/>
-        </w:rPr>
-        <w:t>The fight.</w:t>
-      </w:r>
-      <w:r>
-        <w:rPr>
-          <w:rFonts w:ascii="Georgia" w:hAnsi="Georgia" w:cs="Georgia"/>
-          <w:b w:val="0"/>
-          <w:i w:val="0"/>
-          <w:color w:val="222222"/>
-          <w:sz w:val="19"/>
-        </w:rPr>
-        <w:t xml:space="preserve"> Shadowflame, CR 4 (appendix). It splits into three identical illusions; Intelligence (Arcana) or Wisdom (Perception) DC 18 to pick the real one. Terror Wave in a 15 foot cone (Wisdom DC 14 or frightened); Shadowmeld to teleport through the mist.</w:t>
+        <w:t>▶ Wisdom (Perception) DC 14 to notice the unnatural silence; Intelligence (Arcana) DC 15 to sense necrotic planar energy soaked into the shadows.</w:t>
       </w:r>
     </w:p>
     <w:p>
@@ -2010,12 +1870,22 @@
       <w:r>
         <w:rPr>
           <w:rFonts w:ascii="Georgia" w:hAnsi="Georgia" w:cs="Georgia"/>
+          <w:b/>
+          <w:i w:val="0"/>
+          <w:color w:val="222222"/>
+          <w:sz w:val="21"/>
+        </w:rPr>
+        <w:t>Ursa</w:t>
+      </w:r>
+      <w:r>
+        <w:rPr>
+          <w:rFonts w:ascii="Georgia" w:hAnsi="Georgia" w:cs="Georgia"/>
           <w:b w:val="0"/>
           <w:i w:val="0"/>
           <w:color w:val="222222"/>
           <w:sz w:val="21"/>
         </w:rPr>
-        <w:t>The clearing becomes a hall of dark mirrors. Four grinning shadows circle the party, moving as one, and blades pass through two of them before Lilly starts calling out which flame casts no light. Stabby is frightened for exactly one round, which he later denies. Floraburst's very first act as a companion is to snap a Razor Leaf through an illusion, and her second is to hit the real one. When the Shadowflame finally comes apart with a bone-chilling screech, the mist unravels with it.</w:t>
+        <w:t>, whispering, his breath misting: “This does not feel right. Something is here. The forest itself feels sick.”</w:t>
       </w:r>
     </w:p>
     <w:p>
@@ -2035,7 +1905,7 @@
           <w:color w:val="222222"/>
           <w:sz w:val="21"/>
         </w:rPr>
-        <w:t xml:space="preserve">Where it fell, a </w:t>
+        <w:t xml:space="preserve">The mist thickens until the party can see barely twenty feet. The temperature plummets. A hollow laughter echoes through the trees, vibrating up through the ground, and from the swirling shadows two glowing eyes open. A twisted, flickering shape gathers itself out of dark purple flame: a </w:t>
       </w:r>
       <w:r>
         <w:rPr>
@@ -2045,7 +1915,7 @@
           <w:color w:val="222222"/>
           <w:sz w:val="21"/>
         </w:rPr>
-        <w:t>Dark Mote</w:t>
+        <w:t>Shadowflame</w:t>
       </w:r>
       <w:r>
         <w:rPr>
@@ -2055,7 +1925,7 @@
           <w:color w:val="222222"/>
           <w:sz w:val="21"/>
         </w:rPr>
-        <w:t xml:space="preserve"> lingers, swirling with shadowy energy, pulsing faintly before it fades into the cold air. It does not feel like the others.</w:t>
+        <w:t>, its jagged mouth curled into a grin, wisps of shadow trailing from its limbs like ghostly fire.</w:t>
       </w:r>
     </w:p>
     <w:p>
@@ -2075,7 +1945,7 @@
           <w:color w:val="222222"/>
           <w:sz w:val="21"/>
         </w:rPr>
-        <w:t>Ursa</w:t>
+        <w:t>Shadowflame</w:t>
       </w:r>
       <w:r>
         <w:rPr>
@@ -2085,337 +1955,7 @@
           <w:color w:val="222222"/>
           <w:sz w:val="21"/>
         </w:rPr>
-        <w:t xml:space="preserve">, shivering: “These motes... it is like each one is a piece of something much bigger.” </w:t>
-      </w:r>
-      <w:r>
-        <w:rPr>
-          <w:rFonts w:ascii="Georgia" w:hAnsi="Georgia" w:cs="Georgia"/>
-          <w:b/>
-          <w:i w:val="0"/>
-          <w:color w:val="222222"/>
-          <w:sz w:val="21"/>
-        </w:rPr>
-        <w:t>Lilly</w:t>
-      </w:r>
-      <w:r>
-        <w:rPr>
-          <w:rFonts w:ascii="Georgia" w:hAnsi="Georgia" w:cs="Georgia"/>
-          <w:b w:val="0"/>
-          <w:i w:val="0"/>
-          <w:color w:val="222222"/>
-          <w:sz w:val="21"/>
-        </w:rPr>
-        <w:t xml:space="preserve">, watching the Essence Sphere stir faintly in response: “Then we keep collecting the pieces. For the world, and for Pikachu.” </w:t>
-      </w:r>
-      <w:r>
-        <w:rPr>
-          <w:rFonts w:ascii="Georgia" w:hAnsi="Georgia" w:cs="Georgia"/>
-          <w:b/>
-          <w:i w:val="0"/>
-          <w:color w:val="222222"/>
-          <w:sz w:val="21"/>
-        </w:rPr>
-        <w:t>Stabby</w:t>
-      </w:r>
-      <w:r>
-        <w:rPr>
-          <w:rFonts w:ascii="Georgia" w:hAnsi="Georgia" w:cs="Georgia"/>
-          <w:b w:val="0"/>
-          <w:i w:val="0"/>
-          <w:color w:val="222222"/>
-          <w:sz w:val="21"/>
-        </w:rPr>
-        <w:t>, grinning: “More shadows, more fights! We are going to need sharper swords!”</w:t>
-      </w:r>
-    </w:p>
-    <w:p>
-      <w:pPr>
-        <w:keepNext/>
-        <w:spacing w:before="220" w:after="60"/>
-      </w:pPr>
-      <w:r>
-        <w:rPr>
-          <w:rFonts w:ascii="Georgia" w:hAnsi="Georgia" w:cs="Georgia"/>
-          <w:b/>
-          <w:color w:val="A0522D"/>
-          <w:sz w:val="26"/>
-        </w:rPr>
-        <w:t>Whisperwind Meadow</w:t>
-      </w:r>
-    </w:p>
-    <w:p>
-      <w:pPr>
-        <w:pBdr>
-          <w:left w:val="single" w:sz="18" w:space="12" w:color="B8860B"/>
-        </w:pBdr>
-        <w:shd w:val="clear" w:color="auto" w:fill="FBF6EA"/>
-        <w:spacing w:before="30" w:after="70"/>
-        <w:ind w:left="340" w:right="340"/>
-      </w:pPr>
-      <w:r>
-        <w:rPr>
-          <w:rFonts w:ascii="Georgia" w:hAnsi="Georgia" w:cs="Georgia"/>
-          <w:b w:val="0"/>
-          <w:i w:val="0"/>
-          <w:color w:val="222222"/>
-          <w:sz w:val="21"/>
-        </w:rPr>
-        <w:t xml:space="preserve">Beyond the thicket the land opens into </w:t>
-      </w:r>
-      <w:r>
-        <w:rPr>
-          <w:rFonts w:ascii="Georgia" w:hAnsi="Georgia" w:cs="Georgia"/>
-          <w:b/>
-          <w:i w:val="0"/>
-          <w:color w:val="222222"/>
-          <w:sz w:val="21"/>
-        </w:rPr>
-        <w:t>Whisperwind Meadow</w:t>
-      </w:r>
-      <w:r>
-        <w:rPr>
-          <w:rFonts w:ascii="Georgia" w:hAnsi="Georgia" w:cs="Georgia"/>
-          <w:b w:val="0"/>
-          <w:i w:val="0"/>
-          <w:color w:val="222222"/>
-          <w:sz w:val="21"/>
-        </w:rPr>
-        <w:t>, and for one golden afternoon the road is kind. The grass runs in long silver waves, and the wind moving through it truly does whisper, half-words in no language anyone knows, as if the air itself is talking in its sleep. The veil is thin here; everyone can feel it, a hum behind the breastbone. But nothing wicked wanders through today. Floraburst dozes on Ursa's pack with her bud turned to the sun, and the Guardians let the meadow's strange lullaby carry them south.</w:t>
-      </w:r>
-    </w:p>
-    <w:p>
-      <w:pPr>
-        <w:keepNext/>
-        <w:spacing w:before="220" w:after="60"/>
-      </w:pPr>
-      <w:r>
-        <w:rPr>
-          <w:rFonts w:ascii="Georgia" w:hAnsi="Georgia" w:cs="Georgia"/>
-          <w:b/>
-          <w:color w:val="A0522D"/>
-          <w:sz w:val="26"/>
-        </w:rPr>
-        <w:t>The Talking Beasts of the Mistwood Path</w:t>
-      </w:r>
-    </w:p>
-    <w:p>
-      <w:pPr>
-        <w:pBdr>
-          <w:left w:val="single" w:sz="18" w:space="12" w:color="B8860B"/>
-        </w:pBdr>
-        <w:shd w:val="clear" w:color="auto" w:fill="FBF6EA"/>
-        <w:spacing w:before="30" w:after="70"/>
-        <w:ind w:left="340" w:right="340"/>
-      </w:pPr>
-      <w:r>
-        <w:rPr>
-          <w:rFonts w:ascii="Georgia" w:hAnsi="Georgia" w:cs="Georgia"/>
-          <w:b w:val="0"/>
-          <w:i w:val="0"/>
-          <w:color w:val="222222"/>
-          <w:sz w:val="21"/>
-        </w:rPr>
-        <w:t xml:space="preserve">Where the meadow meets the old forest, the trail dives into the </w:t>
-      </w:r>
-      <w:r>
-        <w:rPr>
-          <w:rFonts w:ascii="Georgia" w:hAnsi="Georgia" w:cs="Georgia"/>
-          <w:b/>
-          <w:i w:val="0"/>
-          <w:color w:val="222222"/>
-          <w:sz w:val="21"/>
-        </w:rPr>
-        <w:t>Mistwood Path</w:t>
-      </w:r>
-      <w:r>
-        <w:rPr>
-          <w:rFonts w:ascii="Georgia" w:hAnsi="Georgia" w:cs="Georgia"/>
-          <w:b w:val="0"/>
-          <w:i w:val="0"/>
-          <w:color w:val="222222"/>
-          <w:sz w:val="21"/>
-        </w:rPr>
-        <w:t>, and the fog comes back with a grudge. Twisted trees knit out the sun, the mist curls around ankles, and every footstep lands muffled, as if the forest is holding a pillow over the sound.</w:t>
-      </w:r>
-    </w:p>
-    <w:p>
-      <w:pPr>
-        <w:pBdr>
-          <w:left w:val="single" w:sz="18" w:space="12" w:color="5B2A86"/>
-        </w:pBdr>
-        <w:shd w:val="clear" w:color="auto" w:fill="F4F0FA"/>
-        <w:spacing w:before="30" w:after="70"/>
-        <w:ind w:left="340" w:right="340"/>
-      </w:pPr>
-      <w:r>
-        <w:rPr>
-          <w:rFonts w:ascii="Georgia" w:hAnsi="Georgia" w:cs="Georgia"/>
-          <w:b w:val="0"/>
-          <w:i w:val="0"/>
-          <w:color w:val="222222"/>
-          <w:sz w:val="19"/>
-        </w:rPr>
-        <w:t>▶ Wisdom (Perception) DC 15: shapes flickering in the fog, pacing the party. Wisdom (Survival) DC 14: padded tracks that stop abruptly, mid-stride. Intelligence (Arcana) DC 16: planar distortion is warping the creatures here, granting them abilities they should not have.</w:t>
-      </w:r>
-    </w:p>
-    <w:p>
-      <w:pPr>
-        <w:pBdr>
-          <w:left w:val="single" w:sz="18" w:space="12" w:color="B8860B"/>
-        </w:pBdr>
-        <w:shd w:val="clear" w:color="auto" w:fill="FBF6EA"/>
-        <w:spacing w:before="30" w:after="70"/>
-        <w:ind w:left="340" w:right="340"/>
-      </w:pPr>
-      <w:r>
-        <w:rPr>
-          <w:rFonts w:ascii="Georgia" w:hAnsi="Georgia" w:cs="Georgia"/>
-          <w:b/>
-          <w:i w:val="0"/>
-          <w:color w:val="222222"/>
-          <w:sz w:val="21"/>
-        </w:rPr>
-        <w:t>Ursa</w:t>
-      </w:r>
-      <w:r>
-        <w:rPr>
-          <w:rFonts w:ascii="Georgia" w:hAnsi="Georgia" w:cs="Georgia"/>
-          <w:b w:val="0"/>
-          <w:i w:val="0"/>
-          <w:color w:val="222222"/>
-          <w:sz w:val="21"/>
-        </w:rPr>
-        <w:t>, crouched over the tracks: “They just... stop. These creatures are moving in ways they should not be.”</w:t>
-      </w:r>
-    </w:p>
-    <w:p>
-      <w:pPr>
-        <w:pBdr>
-          <w:left w:val="single" w:sz="18" w:space="12" w:color="B8860B"/>
-        </w:pBdr>
-        <w:shd w:val="clear" w:color="auto" w:fill="FBF6EA"/>
-        <w:spacing w:before="30" w:after="70"/>
-        <w:ind w:left="340" w:right="340"/>
-      </w:pPr>
-      <w:r>
-        <w:rPr>
-          <w:rFonts w:ascii="Georgia" w:hAnsi="Georgia" w:cs="Georgia"/>
-          <w:b w:val="0"/>
-          <w:i w:val="0"/>
-          <w:color w:val="222222"/>
-          <w:sz w:val="21"/>
-        </w:rPr>
-        <w:t xml:space="preserve">A low growl rolls out of the fog, then a sharp whip-crack. Two </w:t>
-      </w:r>
-      <w:r>
-        <w:rPr>
-          <w:rFonts w:ascii="Georgia" w:hAnsi="Georgia" w:cs="Georgia"/>
-          <w:b/>
-          <w:i w:val="0"/>
-          <w:color w:val="222222"/>
-          <w:sz w:val="21"/>
-        </w:rPr>
-        <w:t>Displacer Beasts</w:t>
-      </w:r>
-      <w:r>
-        <w:rPr>
-          <w:rFonts w:ascii="Georgia" w:hAnsi="Georgia" w:cs="Georgia"/>
-          <w:b w:val="0"/>
-          <w:i w:val="0"/>
-          <w:color w:val="222222"/>
-          <w:sz w:val="21"/>
-        </w:rPr>
-        <w:t xml:space="preserve"> flow out of the white: sleek, six-legged, black as spilled ink, long barbed tentacles lashing over their shoulders. Their outlines shimmer and slide, each one standing a step to the left of wherever it actually is. And then comes the thing that makes the party's blood run colder than the fog. The beasts </w:t>
-      </w:r>
-      <w:r>
-        <w:rPr>
-          <w:rFonts w:ascii="Georgia" w:hAnsi="Georgia" w:cs="Georgia"/>
-          <w:b w:val="0"/>
-          <w:i/>
-          <w:color w:val="222222"/>
-          <w:sz w:val="21"/>
-        </w:rPr>
-        <w:t>speak</w:t>
-      </w:r>
-      <w:r>
-        <w:rPr>
-          <w:rFonts w:ascii="Georgia" w:hAnsi="Georgia" w:cs="Georgia"/>
-          <w:b w:val="0"/>
-          <w:i w:val="0"/>
-          <w:color w:val="222222"/>
-          <w:sz w:val="21"/>
-        </w:rPr>
-        <w:t>.</w:t>
-      </w:r>
-    </w:p>
-    <w:p>
-      <w:pPr>
-        <w:pBdr>
-          <w:left w:val="single" w:sz="18" w:space="12" w:color="B8860B"/>
-        </w:pBdr>
-        <w:shd w:val="clear" w:color="auto" w:fill="FBF6EA"/>
-        <w:spacing w:before="30" w:after="70"/>
-        <w:ind w:left="340" w:right="340"/>
-      </w:pPr>
-      <w:r>
-        <w:rPr>
-          <w:rFonts w:ascii="Georgia" w:hAnsi="Georgia" w:cs="Georgia"/>
-          <w:b/>
-          <w:i w:val="0"/>
-          <w:color w:val="222222"/>
-          <w:sz w:val="21"/>
-        </w:rPr>
-        <w:t>First beast</w:t>
-      </w:r>
-      <w:r>
-        <w:rPr>
-          <w:rFonts w:ascii="Georgia" w:hAnsi="Georgia" w:cs="Georgia"/>
-          <w:b w:val="0"/>
-          <w:i w:val="0"/>
-          <w:color w:val="222222"/>
-          <w:sz w:val="21"/>
-        </w:rPr>
-        <w:t xml:space="preserve">, flickering in and out of sight: “Fresh prey... too easy.” </w:t>
-      </w:r>
-      <w:r>
-        <w:rPr>
-          <w:rFonts w:ascii="Georgia" w:hAnsi="Georgia" w:cs="Georgia"/>
-          <w:b/>
-          <w:i w:val="0"/>
-          <w:color w:val="222222"/>
-          <w:sz w:val="21"/>
-        </w:rPr>
-        <w:t>Second beast</w:t>
-      </w:r>
-      <w:r>
-        <w:rPr>
-          <w:rFonts w:ascii="Georgia" w:hAnsi="Georgia" w:cs="Georgia"/>
-          <w:b w:val="0"/>
-          <w:i w:val="0"/>
-          <w:color w:val="222222"/>
-          <w:sz w:val="21"/>
-        </w:rPr>
-        <w:t>, tentacles lashing: “They will never see it coming.”</w:t>
-      </w:r>
-    </w:p>
-    <w:p>
-      <w:pPr>
-        <w:pBdr>
-          <w:left w:val="single" w:sz="18" w:space="12" w:color="B8860B"/>
-        </w:pBdr>
-        <w:shd w:val="clear" w:color="auto" w:fill="FBF6EA"/>
-        <w:spacing w:before="30" w:after="70"/>
-        <w:ind w:left="340" w:right="340"/>
-      </w:pPr>
-      <w:r>
-        <w:rPr>
-          <w:rFonts w:ascii="Georgia" w:hAnsi="Georgia" w:cs="Georgia"/>
-          <w:b w:val="0"/>
-          <w:i w:val="0"/>
-          <w:color w:val="222222"/>
-          <w:sz w:val="21"/>
-        </w:rPr>
-        <w:t>Displacer beasts do not talk. Everyone knows displacer beasts do not talk. The fog suddenly feels less like weather and more like a doorway someone left open.</w:t>
+        <w:t>, in a whispery, disembodied voice: “Your fears are tasty... let me see them... let me taste them!”</w:t>
       </w:r>
     </w:p>
     <w:p>
@@ -2471,7 +2011,7 @@
           <w:color w:val="888888"/>
           <w:sz w:val="18"/>
         </w:rPr>
-        <w:t>The talking Displacer Beasts flow out of the Mistwood fog.</w:t>
+        <w:t>The Shadowflame splits into a hall of grinning illusions.</w:t>
       </w:r>
     </w:p>
     <w:p>
@@ -2511,7 +2051,7 @@
           <w:color w:val="222222"/>
           <w:sz w:val="19"/>
         </w:rPr>
-        <w:t xml:space="preserve"> Two displacer beasts (appendix). Displacement: attacks against each beast have disadvantage until it takes damage. Ursa's Faerie Fire stripped the trick away, and Stabby deflected a tentacle mid-swing to turn the tide.</w:t>
+        <w:t xml:space="preserve"> Shadowflame, CR 4 (appendix). It splits into three identical illusions; Intelligence (Arcana) or Wisdom (Perception) DC 18 to pick the real one. Terror Wave in a 15 foot cone (Wisdom DC 14 or frightened); Shadowmeld to teleport through the mist.</w:t>
       </w:r>
     </w:p>
     <w:p>
@@ -2531,27 +2071,7 @@
           <w:color w:val="222222"/>
           <w:sz w:val="21"/>
         </w:rPr>
-        <w:t>When the beasts finally fall, their bodies shimmer and dissolve into wisps of mist, leaving only faint outlines on the ground. And beneath where they fell, strange runes lie etched into the forest floor, pulsing with a dark planar light.</w:t>
-      </w:r>
-    </w:p>
-    <w:p>
-      <w:pPr>
-        <w:pBdr>
-          <w:left w:val="single" w:sz="18" w:space="12" w:color="5B2A86"/>
-        </w:pBdr>
-        <w:shd w:val="clear" w:color="auto" w:fill="F4F0FA"/>
-        <w:spacing w:before="30" w:after="70"/>
-        <w:ind w:left="340" w:right="340"/>
-      </w:pPr>
-      <w:r>
-        <w:rPr>
-          <w:rFonts w:ascii="Georgia" w:hAnsi="Georgia" w:cs="Georgia"/>
-          <w:b w:val="0"/>
-          <w:i w:val="0"/>
-          <w:color w:val="222222"/>
-          <w:sz w:val="19"/>
-        </w:rPr>
-        <w:t>▶ Intelligence (Arcana) DC 15: the runes are tears in the fabric of reality, seams where creatures from other planes seep into this one.</w:t>
+        <w:t>The clearing becomes a hall of dark mirrors. Four grinning shadows circle the party, moving as one, and blades pass through two of them before Lilly starts calling out which flame casts no light. Stabby is frightened for exactly one round, which he later denies. Floraburst's very first act as a companion is to snap a Razor Leaf through an illusion, and her second is to hit the real one. When the Shadowflame finally comes apart with a bone-chilling screech, the mist unravels with it.</w:t>
       </w:r>
     </w:p>
     <w:p>
@@ -2566,12 +2086,22 @@
       <w:r>
         <w:rPr>
           <w:rFonts w:ascii="Georgia" w:hAnsi="Georgia" w:cs="Georgia"/>
+          <w:b w:val="0"/>
+          <w:i w:val="0"/>
+          <w:color w:val="222222"/>
+          <w:sz w:val="21"/>
+        </w:rPr>
+        <w:t xml:space="preserve">Where it fell, a </w:t>
+      </w:r>
+      <w:r>
+        <w:rPr>
+          <w:rFonts w:ascii="Georgia" w:hAnsi="Georgia" w:cs="Georgia"/>
           <w:b/>
           <w:i w:val="0"/>
           <w:color w:val="222222"/>
           <w:sz w:val="21"/>
         </w:rPr>
-        <w:t>Lilly</w:t>
+        <w:t>Dark Mote</w:t>
       </w:r>
       <w:r>
         <w:rPr>
@@ -2581,62 +2111,7 @@
           <w:color w:val="222222"/>
           <w:sz w:val="21"/>
         </w:rPr>
-        <w:t xml:space="preserve">, tracing the air above the runes: “These symbols are like cracks in a mirror. The boundaries between the planes are breaking down.” </w:t>
-      </w:r>
-      <w:r>
-        <w:rPr>
-          <w:rFonts w:ascii="Georgia" w:hAnsi="Georgia" w:cs="Georgia"/>
-          <w:b/>
-          <w:i w:val="0"/>
-          <w:color w:val="222222"/>
-          <w:sz w:val="21"/>
-        </w:rPr>
-        <w:t>Ursa:</w:t>
-      </w:r>
-      <w:r>
-        <w:rPr>
-          <w:rFonts w:ascii="Georgia" w:hAnsi="Georgia" w:cs="Georgia"/>
-          <w:b w:val="0"/>
-          <w:i w:val="0"/>
-          <w:color w:val="222222"/>
-          <w:sz w:val="21"/>
-        </w:rPr>
-        <w:t xml:space="preserve"> “Then worse things than talking cats are going to come through.” </w:t>
-      </w:r>
-      <w:r>
-        <w:rPr>
-          <w:rFonts w:ascii="Georgia" w:hAnsi="Georgia" w:cs="Georgia"/>
-          <w:b/>
-          <w:i w:val="0"/>
-          <w:color w:val="222222"/>
-          <w:sz w:val="21"/>
-        </w:rPr>
-        <w:t>Stabby:</w:t>
-      </w:r>
-      <w:r>
-        <w:rPr>
-          <w:rFonts w:ascii="Georgia" w:hAnsi="Georgia" w:cs="Georgia"/>
-          <w:b w:val="0"/>
-          <w:i w:val="0"/>
-          <w:color w:val="222222"/>
-          <w:sz w:val="21"/>
-        </w:rPr>
-        <w:t xml:space="preserve"> “Good thing we are here to stop them!”</w:t>
-      </w:r>
-    </w:p>
-    <w:p>
-      <w:pPr>
-        <w:keepNext/>
-        <w:spacing w:before="220" w:after="60"/>
-      </w:pPr>
-      <w:r>
-        <w:rPr>
-          <w:rFonts w:ascii="Georgia" w:hAnsi="Georgia" w:cs="Georgia"/>
-          <w:b/>
-          <w:color w:val="A0522D"/>
-          <w:sz w:val="26"/>
-        </w:rPr>
-        <w:t>The Shroomyte Grove</w:t>
+        <w:t xml:space="preserve"> lingers, swirling with shadowy energy, pulsing faintly before it fades into the cold air. It does not feel like the others.</w:t>
       </w:r>
     </w:p>
     <w:p>
@@ -2651,12 +2126,22 @@
       <w:r>
         <w:rPr>
           <w:rFonts w:ascii="Georgia" w:hAnsi="Georgia" w:cs="Georgia"/>
+          <w:b/>
+          <w:i w:val="0"/>
+          <w:color w:val="222222"/>
+          <w:sz w:val="21"/>
+        </w:rPr>
+        <w:t>Ursa</w:t>
+      </w:r>
+      <w:r>
+        <w:rPr>
+          <w:rFonts w:ascii="Georgia" w:hAnsi="Georgia" w:cs="Georgia"/>
           <w:b w:val="0"/>
           <w:i w:val="0"/>
           <w:color w:val="222222"/>
           <w:sz w:val="21"/>
         </w:rPr>
-        <w:t xml:space="preserve">The path climbs into the </w:t>
+        <w:t xml:space="preserve">, shivering: “These motes... it is like each one is a piece of something much bigger.” </w:t>
       </w:r>
       <w:r>
         <w:rPr>
@@ -2666,7 +2151,7 @@
           <w:color w:val="222222"/>
           <w:sz w:val="21"/>
         </w:rPr>
-        <w:t>Ironroot Hills</w:t>
+        <w:t>Lilly</w:t>
       </w:r>
       <w:r>
         <w:rPr>
@@ -2676,27 +2161,42 @@
           <w:color w:val="222222"/>
           <w:sz w:val="21"/>
         </w:rPr>
-        <w:t>, named for the iron-hard roots that twist through the earth like veins of metal. The higher the party climbs, the stranger the hills grow: bulbous mushrooms sprout between the rocks, their caps glowing with eerie blue-green light, until the whole hillside shines like a dream having a dream.</w:t>
-      </w:r>
-    </w:p>
-    <w:p>
-      <w:pPr>
-        <w:pBdr>
-          <w:left w:val="single" w:sz="18" w:space="12" w:color="5B2A86"/>
-        </w:pBdr>
-        <w:shd w:val="clear" w:color="auto" w:fill="F4F0FA"/>
-        <w:spacing w:before="30" w:after="70"/>
-        <w:ind w:left="340" w:right="340"/>
-      </w:pPr>
+        <w:t xml:space="preserve">, watching the Essence Sphere stir faintly in response: “Then we keep collecting the pieces. For the world, and for Pikachu.” </w:t>
+      </w:r>
+      <w:r>
+        <w:rPr>
+          <w:rFonts w:ascii="Georgia" w:hAnsi="Georgia" w:cs="Georgia"/>
+          <w:b/>
+          <w:i w:val="0"/>
+          <w:color w:val="222222"/>
+          <w:sz w:val="21"/>
+        </w:rPr>
+        <w:t>Stabby</w:t>
+      </w:r>
       <w:r>
         <w:rPr>
           <w:rFonts w:ascii="Georgia" w:hAnsi="Georgia" w:cs="Georgia"/>
           <w:b w:val="0"/>
           <w:i w:val="0"/>
           <w:color w:val="222222"/>
-          <w:sz w:val="19"/>
-        </w:rPr>
-        <w:t>▶ Wisdom (Perception) DC 14: the ground pulses faintly; the roots shift. Intelligence (Arcana) DC 15: the mushrooms are suffused with Feywild energy, reacting to the party's presence.</w:t>
+          <w:sz w:val="21"/>
+        </w:rPr>
+        <w:t>, grinning: “More shadows, more fights! We are going to need sharper swords!”</w:t>
+      </w:r>
+    </w:p>
+    <w:p>
+      <w:pPr>
+        <w:keepNext/>
+        <w:spacing w:before="220" w:after="60"/>
+      </w:pPr>
+      <w:r>
+        <w:rPr>
+          <w:rFonts w:ascii="Georgia" w:hAnsi="Georgia" w:cs="Georgia"/>
+          <w:b/>
+          <w:color w:val="A0522D"/>
+          <w:sz w:val="26"/>
+        </w:rPr>
+        <w:t>Whisperwind Meadow</w:t>
       </w:r>
     </w:p>
     <w:p>
@@ -2711,12 +2211,22 @@
       <w:r>
         <w:rPr>
           <w:rFonts w:ascii="Georgia" w:hAnsi="Georgia" w:cs="Georgia"/>
+          <w:b w:val="0"/>
+          <w:i w:val="0"/>
+          <w:color w:val="222222"/>
+          <w:sz w:val="21"/>
+        </w:rPr>
+        <w:t xml:space="preserve">Beyond the thicket the land opens into </w:t>
+      </w:r>
+      <w:r>
+        <w:rPr>
+          <w:rFonts w:ascii="Georgia" w:hAnsi="Georgia" w:cs="Georgia"/>
           <w:b/>
           <w:i w:val="0"/>
           <w:color w:val="222222"/>
           <w:sz w:val="21"/>
         </w:rPr>
-        <w:t>Lilly</w:t>
+        <w:t>Whisperwind Meadow</w:t>
       </w:r>
       <w:r>
         <w:rPr>
@@ -2726,97 +2236,7 @@
           <w:color w:val="222222"/>
           <w:sz w:val="21"/>
         </w:rPr>
-        <w:t xml:space="preserve">, adjusting her goggles: “These mushrooms are not just glowing. They are responding to us. Be ready for anything.” </w:t>
-      </w:r>
-      <w:r>
-        <w:rPr>
-          <w:rFonts w:ascii="Georgia" w:hAnsi="Georgia" w:cs="Georgia"/>
-          <w:b/>
-          <w:i w:val="0"/>
-          <w:color w:val="222222"/>
-          <w:sz w:val="21"/>
-        </w:rPr>
-        <w:t>Stabby</w:t>
-      </w:r>
-      <w:r>
-        <w:rPr>
-          <w:rFonts w:ascii="Georgia" w:hAnsi="Georgia" w:cs="Georgia"/>
-          <w:b w:val="0"/>
-          <w:i w:val="0"/>
-          <w:color w:val="222222"/>
-          <w:sz w:val="21"/>
-        </w:rPr>
-        <w:t>, twirling his sword: “Living mushrooms? Bet they are not ready for a good stabbing.”</w:t>
-      </w:r>
-    </w:p>
-    <w:p>
-      <w:pPr>
-        <w:pBdr>
-          <w:left w:val="single" w:sz="18" w:space="12" w:color="B8860B"/>
-        </w:pBdr>
-        <w:shd w:val="clear" w:color="auto" w:fill="FBF6EA"/>
-        <w:spacing w:before="30" w:after="70"/>
-        <w:ind w:left="340" w:right="340"/>
-      </w:pPr>
-      <w:r>
-        <w:rPr>
-          <w:rFonts w:ascii="Georgia" w:hAnsi="Georgia" w:cs="Georgia"/>
-          <w:b w:val="0"/>
-          <w:i w:val="0"/>
-          <w:color w:val="222222"/>
-          <w:sz w:val="21"/>
-        </w:rPr>
-        <w:t xml:space="preserve">The moment the party steps into a clearing ringed with glowing caps, the ground shudders. With a series of wet, tearing sounds, four </w:t>
-      </w:r>
-      <w:r>
-        <w:rPr>
-          <w:rFonts w:ascii="Georgia" w:hAnsi="Georgia" w:cs="Georgia"/>
-          <w:b/>
-          <w:i w:val="0"/>
-          <w:color w:val="222222"/>
-          <w:sz w:val="21"/>
-        </w:rPr>
-        <w:t>Shroomytes</w:t>
-      </w:r>
-      <w:r>
-        <w:rPr>
-          <w:rFonts w:ascii="Georgia" w:hAnsi="Georgia" w:cs="Georgia"/>
-          <w:b w:val="0"/>
-          <w:i w:val="0"/>
-          <w:color w:val="222222"/>
-          <w:sz w:val="21"/>
-        </w:rPr>
-        <w:t xml:space="preserve"> pull themselves free of the soil, squat fungal bodies pulsing with inner light, tendrils of mycelium writhing like grasping fingers. A melodic hum rises from them, beautiful and menacing at once.</w:t>
-      </w:r>
-    </w:p>
-    <w:p>
-      <w:pPr>
-        <w:pBdr>
-          <w:left w:val="single" w:sz="18" w:space="12" w:color="B8860B"/>
-        </w:pBdr>
-        <w:shd w:val="clear" w:color="auto" w:fill="FBF6EA"/>
-        <w:spacing w:before="30" w:after="70"/>
-        <w:ind w:left="340" w:right="340"/>
-      </w:pPr>
-      <w:r>
-        <w:rPr>
-          <w:rFonts w:ascii="Georgia" w:hAnsi="Georgia" w:cs="Georgia"/>
-          <w:b/>
-          <w:i w:val="0"/>
-          <w:color w:val="222222"/>
-          <w:sz w:val="21"/>
-        </w:rPr>
-        <w:t>Shroomyte</w:t>
-      </w:r>
-      <w:r>
-        <w:rPr>
-          <w:rFonts w:ascii="Georgia" w:hAnsi="Georgia" w:cs="Georgia"/>
-          <w:b w:val="0"/>
-          <w:i w:val="0"/>
-          <w:color w:val="222222"/>
-          <w:sz w:val="21"/>
-        </w:rPr>
-        <w:t>, in a vibrating, musical tone: “Intruders... the grove... must be protected!”</w:t>
+        <w:t>, and for one golden afternoon the road is kind. The grass runs in long silver waves, and the wind moving through it truly does whisper, half-words in no language anyone knows, as if the air itself is talking in its sleep. The veil is thin here; everyone can feel it, a hum behind the breastbone. But nothing wicked wanders through today. Floraburst dozes on Ursa's pack with her bud turned to the sun, and the Guardians let the meadow's strange lullaby carry them south.</w:t>
       </w:r>
     </w:p>
     <w:p>
@@ -2828,7 +2248,7 @@
       <w:r>
         <w:drawing>
           <wp:inline xmlns:a="http://schemas.openxmlformats.org/drawingml/2006/main" xmlns:pic="http://schemas.openxmlformats.org/drawingml/2006/picture">
-            <wp:extent cx="3840480" cy="3840480"/>
+            <wp:extent cx="2743200" cy="2743200"/>
             <wp:docPr id="9" name="Picture 9"/>
             <wp:cNvGraphicFramePr>
               <a:graphicFrameLocks noChangeAspect="1"/>
@@ -2849,7 +2269,7 @@
                   <pic:spPr>
                     <a:xfrm>
                       <a:off x="0" y="0"/>
-                      <a:ext cx="3840480" cy="3840480"/>
+                      <a:ext cx="2743200" cy="2743200"/>
                     </a:xfrm>
                     <a:prstGeom prst="rect"/>
                   </pic:spPr>
@@ -2872,7 +2292,62 @@
           <w:color w:val="888888"/>
           <w:sz w:val="18"/>
         </w:rPr>
-        <w:t>The Shroomytes rise from the glowing grove of the Ironroot Hills.</w:t>
+        <w:t>One golden afternoon of kindness: Whisperwind Meadow.</w:t>
+      </w:r>
+    </w:p>
+    <w:p>
+      <w:pPr>
+        <w:keepNext/>
+        <w:spacing w:before="220" w:after="60"/>
+      </w:pPr>
+      <w:r>
+        <w:rPr>
+          <w:rFonts w:ascii="Georgia" w:hAnsi="Georgia" w:cs="Georgia"/>
+          <w:b/>
+          <w:color w:val="A0522D"/>
+          <w:sz w:val="26"/>
+        </w:rPr>
+        <w:t>The Talking Beasts of the Mistwood Path</w:t>
+      </w:r>
+    </w:p>
+    <w:p>
+      <w:pPr>
+        <w:pBdr>
+          <w:left w:val="single" w:sz="18" w:space="12" w:color="B8860B"/>
+        </w:pBdr>
+        <w:shd w:val="clear" w:color="auto" w:fill="FBF6EA"/>
+        <w:spacing w:before="30" w:after="70"/>
+        <w:ind w:left="340" w:right="340"/>
+      </w:pPr>
+      <w:r>
+        <w:rPr>
+          <w:rFonts w:ascii="Georgia" w:hAnsi="Georgia" w:cs="Georgia"/>
+          <w:b w:val="0"/>
+          <w:i w:val="0"/>
+          <w:color w:val="222222"/>
+          <w:sz w:val="21"/>
+        </w:rPr>
+        <w:t xml:space="preserve">Where the meadow meets the old forest, the trail dives into the </w:t>
+      </w:r>
+      <w:r>
+        <w:rPr>
+          <w:rFonts w:ascii="Georgia" w:hAnsi="Georgia" w:cs="Georgia"/>
+          <w:b/>
+          <w:i w:val="0"/>
+          <w:color w:val="222222"/>
+          <w:sz w:val="21"/>
+        </w:rPr>
+        <w:t>Mistwood Path</w:t>
+      </w:r>
+      <w:r>
+        <w:rPr>
+          <w:rFonts w:ascii="Georgia" w:hAnsi="Georgia" w:cs="Georgia"/>
+          <w:b w:val="0"/>
+          <w:i w:val="0"/>
+          <w:color w:val="222222"/>
+          <w:sz w:val="21"/>
+        </w:rPr>
+        <w:t>, and the fog comes back with a grudge. Twisted trees knit out the sun, the mist curls around ankles, and every footstep lands muffled, as if the forest is holding a pillow over the sound.</w:t>
       </w:r>
     </w:p>
     <w:p>
@@ -2892,27 +2367,7 @@
           <w:color w:val="222222"/>
           <w:sz w:val="19"/>
         </w:rPr>
-        <w:t xml:space="preserve">▶ </w:t>
-      </w:r>
-      <w:r>
-        <w:rPr>
-          <w:rFonts w:ascii="Georgia" w:hAnsi="Georgia" w:cs="Georgia"/>
-          <w:b/>
-          <w:i w:val="0"/>
-          <w:color w:val="222222"/>
-          <w:sz w:val="19"/>
-        </w:rPr>
-        <w:t>The fight.</w:t>
-      </w:r>
-      <w:r>
-        <w:rPr>
-          <w:rFonts w:ascii="Georgia" w:hAnsi="Georgia" w:cs="Georgia"/>
-          <w:b w:val="0"/>
-          <w:i w:val="0"/>
-          <w:color w:val="222222"/>
-          <w:sz w:val="19"/>
-        </w:rPr>
-        <w:t xml:space="preserve"> Four Shroomytes, CR 2 each (appendix). Spore Blasts from range, Mycelium Tendrils to entangle, difficult terrain everywhere. Lilly's fire found their weakness; Stabby simply refused to be caught.</w:t>
+        <w:t>▶ Wisdom (Perception) DC 15: shapes flickering in the fog, pacing the party. Wisdom (Survival) DC 14: padded tracks that stop abruptly, mid-stride. Intelligence (Arcana) DC 16: planar distortion is warping the creatures here, granting them abilities they should not have.</w:t>
       </w:r>
     </w:p>
     <w:p>
@@ -2927,32 +2382,22 @@
       <w:r>
         <w:rPr>
           <w:rFonts w:ascii="Georgia" w:hAnsi="Georgia" w:cs="Georgia"/>
+          <w:b/>
+          <w:i w:val="0"/>
+          <w:color w:val="222222"/>
+          <w:sz w:val="21"/>
+        </w:rPr>
+        <w:t>Ursa</w:t>
+      </w:r>
+      <w:r>
+        <w:rPr>
+          <w:rFonts w:ascii="Georgia" w:hAnsi="Georgia" w:cs="Georgia"/>
           <w:b w:val="0"/>
           <w:i w:val="0"/>
           <w:color w:val="222222"/>
           <w:sz w:val="21"/>
         </w:rPr>
-        <w:t xml:space="preserve">It is a strange, glowing battle among the toadstools, and when the last Shroomyte folds gently back into the earth, the air fills with drifting, luminous spores, falling like warm snow. In the center of the clearing hovers a </w:t>
-      </w:r>
-      <w:r>
-        <w:rPr>
-          <w:rFonts w:ascii="Georgia" w:hAnsi="Georgia" w:cs="Georgia"/>
-          <w:b/>
-          <w:i w:val="0"/>
-          <w:color w:val="222222"/>
-          <w:sz w:val="21"/>
-        </w:rPr>
-        <w:t>Fungal Mote</w:t>
-      </w:r>
-      <w:r>
-        <w:rPr>
-          <w:rFonts w:ascii="Georgia" w:hAnsi="Georgia" w:cs="Georgia"/>
-          <w:b w:val="0"/>
-          <w:i w:val="0"/>
-          <w:color w:val="222222"/>
-          <w:sz w:val="21"/>
-        </w:rPr>
-        <w:t>, pulsing with otherworldly light.</w:t>
+        <w:t>, crouched over the tracks: “They just... stop. These creatures are moving in ways they should not be.”</w:t>
       </w:r>
     </w:p>
     <w:p>
@@ -2967,12 +2412,22 @@
       <w:r>
         <w:rPr>
           <w:rFonts w:ascii="Georgia" w:hAnsi="Georgia" w:cs="Georgia"/>
+          <w:b w:val="0"/>
+          <w:i w:val="0"/>
+          <w:color w:val="222222"/>
+          <w:sz w:val="21"/>
+        </w:rPr>
+        <w:t xml:space="preserve">A low growl rolls out of the fog, then a sharp whip-crack. Two </w:t>
+      </w:r>
+      <w:r>
+        <w:rPr>
+          <w:rFonts w:ascii="Georgia" w:hAnsi="Georgia" w:cs="Georgia"/>
           <w:b/>
           <w:i w:val="0"/>
           <w:color w:val="222222"/>
           <w:sz w:val="21"/>
         </w:rPr>
-        <w:t>Ursa</w:t>
+        <w:t>Displacer Beasts</w:t>
       </w:r>
       <w:r>
         <w:rPr>
@@ -2982,31 +2437,8 @@
           <w:color w:val="222222"/>
           <w:sz w:val="21"/>
         </w:rPr>
-        <w:t>, reaching toward it, its glow reflected in his eyes: “This one feels like the Feywild, bleeding into our world.” The Essence Sphere in Lilly's pack hums in quiet agreement. The collection grows, and so does the mystery.</w:t>
-      </w:r>
-    </w:p>
-    <w:p>
-      <w:pPr>
-        <w:keepNext/>
-        <w:spacing w:before="400" w:after="120"/>
-        <w:pBdr>
-          <w:bottom w:val="single" w:sz="6" w:space="4" w:color="B8860B"/>
-        </w:pBdr>
-      </w:pPr>
-      <w:r>
-        <w:rPr>
-          <w:rFonts w:ascii="Georgia" w:hAnsi="Georgia" w:cs="Georgia"/>
-          <w:b/>
-          <w:color w:val="B8860B"/>
-          <w:sz w:val="32"/>
-        </w:rPr>
-        <w:t>Part Four: Stormwatch Cliffs</w:t>
-      </w:r>
-    </w:p>
-    <w:p>
-      <w:pPr>
-        <w:spacing w:before="120" w:after="200"/>
-      </w:pPr>
+        <w:t xml:space="preserve"> flow out of the white: sleek, six-legged, black as spilled ink, long barbed tentacles lashing over their shoulders. Their outlines shimmer and slide, each one standing a step to the left of wherever it actually is. And then comes the thing that makes the party's blood run colder than the fog. The beasts </w:t>
+      </w:r>
       <w:r>
         <w:rPr>
           <w:rFonts w:ascii="Georgia" w:hAnsi="Georgia" w:cs="Georgia"/>
@@ -3015,7 +2447,17 @@
           <w:color w:val="222222"/>
           <w:sz w:val="21"/>
         </w:rPr>
-        <w:t>By the time the hills gave way to open sky, the party could hear the sea, and the storm that lived above it.</w:t>
+        <w:t>speak</w:t>
+      </w:r>
+      <w:r>
+        <w:rPr>
+          <w:rFonts w:ascii="Georgia" w:hAnsi="Georgia" w:cs="Georgia"/>
+          <w:b w:val="0"/>
+          <w:i w:val="0"/>
+          <w:color w:val="222222"/>
+          <w:sz w:val="21"/>
+        </w:rPr>
+        <w:t>.</w:t>
       </w:r>
     </w:p>
     <w:p>
@@ -3035,7 +2477,7 @@
           <w:color w:val="222222"/>
           <w:sz w:val="21"/>
         </w:rPr>
-        <w:t>Stormwatch Cliffs</w:t>
+        <w:t>First beast</w:t>
       </w:r>
       <w:r>
         <w:rPr>
@@ -3045,22 +2487,27 @@
           <w:color w:val="222222"/>
           <w:sz w:val="21"/>
         </w:rPr>
-        <w:t xml:space="preserve"> rise at the edge of the world: jagged stone ramparts above crashing waves, crowned with black clouds that flicker and grumble with lightning that never quite rests. The air crackles against the skin, tasting of salt and thunder. Etched into the rocks along the clifftop, strange runes glow with a pale blue light, brightening with every distant strike.</w:t>
-      </w:r>
-    </w:p>
-    <w:p>
-      <w:pPr>
-        <w:keepNext/>
-        <w:spacing w:before="220" w:after="60"/>
-      </w:pPr>
+        <w:t xml:space="preserve">, flickering in and out of sight: “Fresh prey... too easy.” </w:t>
+      </w:r>
       <w:r>
         <w:rPr>
           <w:rFonts w:ascii="Georgia" w:hAnsi="Georgia" w:cs="Georgia"/>
           <w:b/>
-          <w:color w:val="A0522D"/>
-          <w:sz w:val="26"/>
-        </w:rPr>
-        <w:t>The Cliff Path</w:t>
+          <w:i w:val="0"/>
+          <w:color w:val="222222"/>
+          <w:sz w:val="21"/>
+        </w:rPr>
+        <w:t>Second beast</w:t>
+      </w:r>
+      <w:r>
+        <w:rPr>
+          <w:rFonts w:ascii="Georgia" w:hAnsi="Georgia" w:cs="Georgia"/>
+          <w:b w:val="0"/>
+          <w:i w:val="0"/>
+          <w:color w:val="222222"/>
+          <w:sz w:val="21"/>
+        </w:rPr>
+        <w:t>, tentacles lashing: “They will never see it coming.”</w:t>
       </w:r>
     </w:p>
     <w:p>
@@ -3080,232 +2527,7 @@
           <w:color w:val="222222"/>
           <w:sz w:val="21"/>
         </w:rPr>
-        <w:t>The only way forward is a narrow path snaking along the cliff's edge, with sheer drops to the hungry ocean below. The wind shoves like a rude giant. Stone crumbles where stone should hold. The Guardians rope together, watch each other's feet, and inch along the ledge while the storm booms overhead.</w:t>
-      </w:r>
-    </w:p>
-    <w:p>
-      <w:pPr>
-        <w:pBdr>
-          <w:left w:val="single" w:sz="18" w:space="12" w:color="5B2A86"/>
-        </w:pBdr>
-        <w:shd w:val="clear" w:color="auto" w:fill="F4F0FA"/>
-        <w:spacing w:before="30" w:after="70"/>
-        <w:ind w:left="340" w:right="340"/>
-      </w:pPr>
-      <w:r>
-        <w:rPr>
-          <w:rFonts w:ascii="Georgia" w:hAnsi="Georgia" w:cs="Georgia"/>
-          <w:b w:val="0"/>
-          <w:i w:val="0"/>
-          <w:color w:val="222222"/>
-          <w:sz w:val="19"/>
-        </w:rPr>
-        <w:t>▶ Skill challenge: Dexterity (Acrobatics) DC 14 on the narrow ledge; Wisdom (Perception) DC 15 to spot the crumbling section before it fell; Intelligence (Arcana) DC 15 to recognize the runes as an ancient magical defense, knowledge that pays off at the monolith. Falls dealt bruises (1d6 to 2d6), not tragedies.</w:t>
-      </w:r>
-    </w:p>
-    <w:p>
-      <w:pPr>
-        <w:keepNext/>
-        <w:spacing w:before="220" w:after="60"/>
-      </w:pPr>
-      <w:r>
-        <w:rPr>
-          <w:rFonts w:ascii="Georgia" w:hAnsi="Georgia" w:cs="Georgia"/>
-          <w:b/>
-          <w:color w:val="A0522D"/>
-          <w:sz w:val="26"/>
-        </w:rPr>
-        <w:t>The Monolith of Four Elements</w:t>
-      </w:r>
-    </w:p>
-    <w:p>
-      <w:pPr>
-        <w:pBdr>
-          <w:left w:val="single" w:sz="18" w:space="12" w:color="B8860B"/>
-        </w:pBdr>
-        <w:shd w:val="clear" w:color="auto" w:fill="FBF6EA"/>
-        <w:spacing w:before="30" w:after="70"/>
-        <w:ind w:left="340" w:right="340"/>
-      </w:pPr>
-      <w:r>
-        <w:rPr>
-          <w:rFonts w:ascii="Georgia" w:hAnsi="Georgia" w:cs="Georgia"/>
-          <w:b w:val="0"/>
-          <w:i w:val="0"/>
-          <w:color w:val="222222"/>
-          <w:sz w:val="21"/>
-        </w:rPr>
-        <w:t xml:space="preserve">Past the worst of the ledge, the path opens onto a circular stone platform carved into the cliffside. At its center stands a </w:t>
-      </w:r>
-      <w:r>
-        <w:rPr>
-          <w:rFonts w:ascii="Georgia" w:hAnsi="Georgia" w:cs="Georgia"/>
-          <w:b/>
-          <w:i w:val="0"/>
-          <w:color w:val="222222"/>
-          <w:sz w:val="21"/>
-        </w:rPr>
-        <w:t>monolith</w:t>
-      </w:r>
-      <w:r>
-        <w:rPr>
-          <w:rFonts w:ascii="Georgia" w:hAnsi="Georgia" w:cs="Georgia"/>
-          <w:b w:val="0"/>
-          <w:i w:val="0"/>
-          <w:color w:val="222222"/>
-          <w:sz w:val="21"/>
-        </w:rPr>
-        <w:t xml:space="preserve">, etched with the same runes as the cliffs, a lightning rod jutting from its peak. Every few minutes the storm reaches down and strikes the rod, and the whole platform glows. Around the monolith stand four smaller pedestals, each crowned with a rotating stone ring of symbols: </w:t>
-      </w:r>
-      <w:r>
-        <w:rPr>
-          <w:rFonts w:ascii="Georgia" w:hAnsi="Georgia" w:cs="Georgia"/>
-          <w:b/>
-          <w:i w:val="0"/>
-          <w:color w:val="222222"/>
-          <w:sz w:val="21"/>
-        </w:rPr>
-        <w:t>Air</w:t>
-      </w:r>
-      <w:r>
-        <w:rPr>
-          <w:rFonts w:ascii="Georgia" w:hAnsi="Georgia" w:cs="Georgia"/>
-          <w:b w:val="0"/>
-          <w:i w:val="0"/>
-          <w:color w:val="222222"/>
-          <w:sz w:val="21"/>
-        </w:rPr>
-        <w:t xml:space="preserve">, </w:t>
-      </w:r>
-      <w:r>
-        <w:rPr>
-          <w:rFonts w:ascii="Georgia" w:hAnsi="Georgia" w:cs="Georgia"/>
-          <w:b/>
-          <w:i w:val="0"/>
-          <w:color w:val="222222"/>
-          <w:sz w:val="21"/>
-        </w:rPr>
-        <w:t>Water</w:t>
-      </w:r>
-      <w:r>
-        <w:rPr>
-          <w:rFonts w:ascii="Georgia" w:hAnsi="Georgia" w:cs="Georgia"/>
-          <w:b w:val="0"/>
-          <w:i w:val="0"/>
-          <w:color w:val="222222"/>
-          <w:sz w:val="21"/>
-        </w:rPr>
-        <w:t xml:space="preserve">, </w:t>
-      </w:r>
-      <w:r>
-        <w:rPr>
-          <w:rFonts w:ascii="Georgia" w:hAnsi="Georgia" w:cs="Georgia"/>
-          <w:b/>
-          <w:i w:val="0"/>
-          <w:color w:val="222222"/>
-          <w:sz w:val="21"/>
-        </w:rPr>
-        <w:t>Earth</w:t>
-      </w:r>
-      <w:r>
-        <w:rPr>
-          <w:rFonts w:ascii="Georgia" w:hAnsi="Georgia" w:cs="Georgia"/>
-          <w:b w:val="0"/>
-          <w:i w:val="0"/>
-          <w:color w:val="222222"/>
-          <w:sz w:val="21"/>
-        </w:rPr>
-        <w:t xml:space="preserve">, and </w:t>
-      </w:r>
-      <w:r>
-        <w:rPr>
-          <w:rFonts w:ascii="Georgia" w:hAnsi="Georgia" w:cs="Georgia"/>
-          <w:b/>
-          <w:i w:val="0"/>
-          <w:color w:val="222222"/>
-          <w:sz w:val="21"/>
-        </w:rPr>
-        <w:t>Fire</w:t>
-      </w:r>
-      <w:r>
-        <w:rPr>
-          <w:rFonts w:ascii="Georgia" w:hAnsi="Georgia" w:cs="Georgia"/>
-          <w:b w:val="0"/>
-          <w:i w:val="0"/>
-          <w:color w:val="222222"/>
-          <w:sz w:val="21"/>
-        </w:rPr>
-        <w:t>.</w:t>
-      </w:r>
-    </w:p>
-    <w:p>
-      <w:pPr>
-        <w:pBdr>
-          <w:left w:val="single" w:sz="18" w:space="12" w:color="B8860B"/>
-        </w:pBdr>
-        <w:shd w:val="clear" w:color="auto" w:fill="FBF6EA"/>
-        <w:spacing w:before="30" w:after="70"/>
-        <w:ind w:left="340" w:right="340"/>
-      </w:pPr>
-      <w:r>
-        <w:rPr>
-          <w:rFonts w:ascii="Georgia" w:hAnsi="Georgia" w:cs="Georgia"/>
-          <w:b w:val="0"/>
-          <w:i w:val="0"/>
-          <w:color w:val="222222"/>
-          <w:sz w:val="21"/>
-        </w:rPr>
-        <w:t xml:space="preserve">Etched into the monolith's base, half-worn by centuries of storms, four phrases: </w:t>
-      </w:r>
-      <w:r>
-        <w:rPr>
-          <w:rFonts w:ascii="Georgia" w:hAnsi="Georgia" w:cs="Georgia"/>
-          <w:b w:val="0"/>
-          <w:i/>
-          <w:color w:val="222222"/>
-          <w:sz w:val="21"/>
-        </w:rPr>
-        <w:t>The winds whisper first. The tide rises after. Stone stands firm next. Flame seals the fate.</w:t>
-      </w:r>
-    </w:p>
-    <w:p>
-      <w:pPr>
-        <w:pBdr>
-          <w:left w:val="single" w:sz="18" w:space="12" w:color="5B2A86"/>
-        </w:pBdr>
-        <w:shd w:val="clear" w:color="auto" w:fill="F4F0FA"/>
-        <w:spacing w:before="30" w:after="70"/>
-        <w:ind w:left="340" w:right="340"/>
-      </w:pPr>
-      <w:r>
-        <w:rPr>
-          <w:rFonts w:ascii="Georgia" w:hAnsi="Georgia" w:cs="Georgia"/>
-          <w:b w:val="0"/>
-          <w:i w:val="0"/>
-          <w:color w:val="222222"/>
-          <w:sz w:val="19"/>
-        </w:rPr>
-        <w:t>▶ The puzzle: align the pedestals Air, then Water, then Earth, then Fire, timed to a lightning strike. Intelligence (Investigation) or Wisdom (Insight) DC 15 to read the sequence from the clues; a wrong alignment discharged 2d6 lightning. The party solved it on the storm's next breath.</w:t>
-      </w:r>
-    </w:p>
-    <w:p>
-      <w:pPr>
-        <w:pBdr>
-          <w:left w:val="single" w:sz="18" w:space="12" w:color="B8860B"/>
-        </w:pBdr>
-        <w:shd w:val="clear" w:color="auto" w:fill="FBF6EA"/>
-        <w:spacing w:before="30" w:after="70"/>
-        <w:ind w:left="340" w:right="340"/>
-      </w:pPr>
-      <w:r>
-        <w:rPr>
-          <w:rFonts w:ascii="Georgia" w:hAnsi="Georgia" w:cs="Georgia"/>
-          <w:b w:val="0"/>
-          <w:i w:val="0"/>
-          <w:color w:val="222222"/>
-          <w:sz w:val="21"/>
-        </w:rPr>
-        <w:t>Stone rings grind into place: wind, tide, stone, flame. The storm inhales. Lightning hammers the rod, and this time the monolith drinks it, humming louder and louder until a beam of pure light lances up into the clouds and blooms into a shimmering curtain of energy above the platform.</w:t>
+        <w:t>Displacer beasts do not talk. Everyone knows displacer beasts do not talk. The fog suddenly feels less like weather and more like a doorway someone left open.</w:t>
       </w:r>
     </w:p>
     <w:p>
@@ -3361,22 +2583,47 @@
           <w:color w:val="888888"/>
           <w:sz w:val="18"/>
         </w:rPr>
-        <w:t>The Dark Figure looms over the monoliths of the Stormwatch Cliffs.</w:t>
+        <w:t>The talking Displacer Beasts flow out of the Mistwood fog.</w:t>
       </w:r>
     </w:p>
     <w:p>
       <w:pPr>
-        <w:keepNext/>
-        <w:spacing w:before="220" w:after="60"/>
-      </w:pPr>
+        <w:pBdr>
+          <w:left w:val="single" w:sz="18" w:space="12" w:color="5B2A86"/>
+        </w:pBdr>
+        <w:shd w:val="clear" w:color="auto" w:fill="F4F0FA"/>
+        <w:spacing w:before="30" w:after="70"/>
+        <w:ind w:left="340" w:right="340"/>
+      </w:pPr>
+      <w:r>
+        <w:rPr>
+          <w:rFonts w:ascii="Georgia" w:hAnsi="Georgia" w:cs="Georgia"/>
+          <w:b w:val="0"/>
+          <w:i w:val="0"/>
+          <w:color w:val="222222"/>
+          <w:sz w:val="19"/>
+        </w:rPr>
+        <w:t xml:space="preserve">▶ </w:t>
+      </w:r>
       <w:r>
         <w:rPr>
           <w:rFonts w:ascii="Georgia" w:hAnsi="Georgia" w:cs="Georgia"/>
           <w:b/>
-          <w:color w:val="A0522D"/>
-          <w:sz w:val="26"/>
-        </w:rPr>
-        <w:t>The Dark Figure</w:t>
+          <w:i w:val="0"/>
+          <w:color w:val="222222"/>
+          <w:sz w:val="19"/>
+        </w:rPr>
+        <w:t>The fight.</w:t>
+      </w:r>
+      <w:r>
+        <w:rPr>
+          <w:rFonts w:ascii="Georgia" w:hAnsi="Georgia" w:cs="Georgia"/>
+          <w:b w:val="0"/>
+          <w:i w:val="0"/>
+          <w:color w:val="222222"/>
+          <w:sz w:val="19"/>
+        </w:rPr>
+        <w:t xml:space="preserve"> Two displacer beasts (appendix). Displacement: attacks against each beast have disadvantage until it takes damage. Ursa's Faerie Fire stripped the trick away, and Stabby deflected a tentacle mid-swing to turn the tide.</w:t>
       </w:r>
     </w:p>
     <w:p>
@@ -3396,7 +2643,27 @@
           <w:color w:val="222222"/>
           <w:sz w:val="21"/>
         </w:rPr>
-        <w:t>Within the curtain of light, a vision takes shape: a towering figure cloaked in darkness, its face hidden, its presence pressing down on the platform like a cold hand. The storm itself seems to lean away from it. When it speaks, the voice does not come through the air. It arrives directly inside their minds.</w:t>
+        <w:t>When the beasts finally fall, their bodies shimmer and dissolve into wisps of mist, leaving only faint outlines on the ground. And beneath where they fell, strange runes lie etched into the forest floor, pulsing with a dark planar light.</w:t>
+      </w:r>
+    </w:p>
+    <w:p>
+      <w:pPr>
+        <w:pBdr>
+          <w:left w:val="single" w:sz="18" w:space="12" w:color="5B2A86"/>
+        </w:pBdr>
+        <w:shd w:val="clear" w:color="auto" w:fill="F4F0FA"/>
+        <w:spacing w:before="30" w:after="70"/>
+        <w:ind w:left="340" w:right="340"/>
+      </w:pPr>
+      <w:r>
+        <w:rPr>
+          <w:rFonts w:ascii="Georgia" w:hAnsi="Georgia" w:cs="Georgia"/>
+          <w:b w:val="0"/>
+          <w:i w:val="0"/>
+          <w:color w:val="222222"/>
+          <w:sz w:val="19"/>
+        </w:rPr>
+        <w:t>▶ Intelligence (Arcana) DC 15: the runes are tears in the fabric of reality, seams where creatures from other planes seep into this one.</w:t>
       </w:r>
     </w:p>
     <w:p>
@@ -3416,7 +2683,7 @@
           <w:color w:val="222222"/>
           <w:sz w:val="21"/>
         </w:rPr>
-        <w:t>The dark figure:</w:t>
+        <w:t>Lilly</w:t>
       </w:r>
       <w:r>
         <w:rPr>
@@ -3426,7 +2693,62 @@
           <w:color w:val="222222"/>
           <w:sz w:val="21"/>
         </w:rPr>
-        <w:t xml:space="preserve"> “You meddle with forces beyond your comprehension. The boundaries between realms are mine to shatter and shape. The goddess's light fades, and chaos will reign. The motes you gather are but embers of a dying flame. You cannot stop the unraveling.”</w:t>
+        <w:t xml:space="preserve">, tracing the air above the runes: “These symbols are like cracks in a mirror. The boundaries between the planes are breaking down.” </w:t>
+      </w:r>
+      <w:r>
+        <w:rPr>
+          <w:rFonts w:ascii="Georgia" w:hAnsi="Georgia" w:cs="Georgia"/>
+          <w:b/>
+          <w:i w:val="0"/>
+          <w:color w:val="222222"/>
+          <w:sz w:val="21"/>
+        </w:rPr>
+        <w:t>Ursa:</w:t>
+      </w:r>
+      <w:r>
+        <w:rPr>
+          <w:rFonts w:ascii="Georgia" w:hAnsi="Georgia" w:cs="Georgia"/>
+          <w:b w:val="0"/>
+          <w:i w:val="0"/>
+          <w:color w:val="222222"/>
+          <w:sz w:val="21"/>
+        </w:rPr>
+        <w:t xml:space="preserve"> “Then worse things than talking cats are going to come through.” </w:t>
+      </w:r>
+      <w:r>
+        <w:rPr>
+          <w:rFonts w:ascii="Georgia" w:hAnsi="Georgia" w:cs="Georgia"/>
+          <w:b/>
+          <w:i w:val="0"/>
+          <w:color w:val="222222"/>
+          <w:sz w:val="21"/>
+        </w:rPr>
+        <w:t>Stabby:</w:t>
+      </w:r>
+      <w:r>
+        <w:rPr>
+          <w:rFonts w:ascii="Georgia" w:hAnsi="Georgia" w:cs="Georgia"/>
+          <w:b w:val="0"/>
+          <w:i w:val="0"/>
+          <w:color w:val="222222"/>
+          <w:sz w:val="21"/>
+        </w:rPr>
+        <w:t xml:space="preserve"> “Good thing we are here to stop them!”</w:t>
+      </w:r>
+    </w:p>
+    <w:p>
+      <w:pPr>
+        <w:keepNext/>
+        <w:spacing w:before="220" w:after="60"/>
+      </w:pPr>
+      <w:r>
+        <w:rPr>
+          <w:rFonts w:ascii="Georgia" w:hAnsi="Georgia" w:cs="Georgia"/>
+          <w:b/>
+          <w:color w:val="A0522D"/>
+          <w:sz w:val="26"/>
+        </w:rPr>
+        <w:t>The Shroomyte Grove</w:t>
       </w:r>
     </w:p>
     <w:p>
@@ -3446,7 +2768,7 @@
           <w:color w:val="222222"/>
           <w:sz w:val="21"/>
         </w:rPr>
-        <w:t xml:space="preserve">The vision collapses into darkness, and the light curtain blows out like a candle. Where it stood, something small falls to the stone with a crystalline chime: a </w:t>
+        <w:t xml:space="preserve">The path climbs into the </w:t>
       </w:r>
       <w:r>
         <w:rPr>
@@ -3456,7 +2778,7 @@
           <w:color w:val="222222"/>
           <w:sz w:val="21"/>
         </w:rPr>
-        <w:t>Dark Fragment</w:t>
+        <w:t>Ironroot Hills</w:t>
       </w:r>
       <w:r>
         <w:rPr>
@@ -3466,260 +2788,7 @@
           <w:color w:val="222222"/>
           <w:sz w:val="21"/>
         </w:rPr>
-        <w:t>, a shard of crystallized energy swirling with elemental chaos, cold to the touch and heavier than it looks.</w:t>
-      </w:r>
-    </w:p>
-    <w:p>
-      <w:pPr>
-        <w:pBdr>
-          <w:left w:val="single" w:sz="18" w:space="12" w:color="5B2A86"/>
-        </w:pBdr>
-        <w:shd w:val="clear" w:color="auto" w:fill="F4F0FA"/>
-        <w:spacing w:before="30" w:after="70"/>
-        <w:ind w:left="340" w:right="340"/>
-      </w:pPr>
-      <w:r>
-        <w:rPr>
-          <w:rFonts w:ascii="Georgia" w:hAnsi="Georgia" w:cs="Georgia"/>
-          <w:b w:val="0"/>
-          <w:i w:val="0"/>
-          <w:color w:val="222222"/>
-          <w:sz w:val="19"/>
-        </w:rPr>
-        <w:t>▶ Intelligence (Arcana) DC 15: the fragment is a remnant of the same power corrupting the planar boundaries, tied directly to the weakening of Elaria. The party keeps it, carefully wrapped.</w:t>
-      </w:r>
-    </w:p>
-    <w:p>
-      <w:pPr>
-        <w:pBdr>
-          <w:left w:val="single" w:sz="18" w:space="12" w:color="B8860B"/>
-        </w:pBdr>
-        <w:shd w:val="clear" w:color="auto" w:fill="FBF6EA"/>
-        <w:spacing w:before="30" w:after="70"/>
-        <w:ind w:left="340" w:right="340"/>
-      </w:pPr>
-      <w:r>
-        <w:rPr>
-          <w:rFonts w:ascii="Georgia" w:hAnsi="Georgia" w:cs="Georgia"/>
-          <w:b w:val="0"/>
-          <w:i w:val="0"/>
-          <w:color w:val="222222"/>
-          <w:sz w:val="21"/>
-        </w:rPr>
-        <w:t xml:space="preserve">Until this moment, the breaking of the world might have been an accident: a storm, a sickness, a slow unlucky fraying. No longer. Someone stood in that light and called the boundaries </w:t>
-      </w:r>
-      <w:r>
-        <w:rPr>
-          <w:rFonts w:ascii="Georgia" w:hAnsi="Georgia" w:cs="Georgia"/>
-          <w:b w:val="0"/>
-          <w:i/>
-          <w:color w:val="222222"/>
-          <w:sz w:val="21"/>
-        </w:rPr>
-        <w:t>mine</w:t>
-      </w:r>
-      <w:r>
-        <w:rPr>
-          <w:rFonts w:ascii="Georgia" w:hAnsi="Georgia" w:cs="Georgia"/>
-          <w:b w:val="0"/>
-          <w:i w:val="0"/>
-          <w:color w:val="222222"/>
-          <w:sz w:val="21"/>
-        </w:rPr>
-        <w:t>. Someone is doing this on purpose.</w:t>
-      </w:r>
-    </w:p>
-    <w:p>
-      <w:pPr>
-        <w:pBdr>
-          <w:left w:val="single" w:sz="18" w:space="12" w:color="B8860B"/>
-        </w:pBdr>
-        <w:shd w:val="clear" w:color="auto" w:fill="FBF6EA"/>
-        <w:spacing w:before="30" w:after="70"/>
-        <w:ind w:left="340" w:right="340"/>
-      </w:pPr>
-      <w:r>
-        <w:rPr>
-          <w:rFonts w:ascii="Georgia" w:hAnsi="Georgia" w:cs="Georgia"/>
-          <w:b/>
-          <w:i w:val="0"/>
-          <w:color w:val="222222"/>
-          <w:sz w:val="21"/>
-        </w:rPr>
-        <w:t>Ursa:</w:t>
-      </w:r>
-      <w:r>
-        <w:rPr>
-          <w:rFonts w:ascii="Georgia" w:hAnsi="Georgia" w:cs="Georgia"/>
-          <w:b w:val="0"/>
-          <w:i w:val="0"/>
-          <w:color w:val="222222"/>
-          <w:sz w:val="21"/>
-        </w:rPr>
-        <w:t xml:space="preserve"> “That figure... they want to unravel everything. We have to stop them.” </w:t>
-      </w:r>
-      <w:r>
-        <w:rPr>
-          <w:rFonts w:ascii="Georgia" w:hAnsi="Georgia" w:cs="Georgia"/>
-          <w:b/>
-          <w:i w:val="0"/>
-          <w:color w:val="222222"/>
-          <w:sz w:val="21"/>
-        </w:rPr>
-        <w:t>Lilly:</w:t>
-      </w:r>
-      <w:r>
-        <w:rPr>
-          <w:rFonts w:ascii="Georgia" w:hAnsi="Georgia" w:cs="Georgia"/>
-          <w:b w:val="0"/>
-          <w:i w:val="0"/>
-          <w:color w:val="222222"/>
-          <w:sz w:val="21"/>
-        </w:rPr>
-        <w:t xml:space="preserve"> “The Artificer's Guild might be our best chance to figure this out, and to bring Pikachu back.” </w:t>
-      </w:r>
-      <w:r>
-        <w:rPr>
-          <w:rFonts w:ascii="Georgia" w:hAnsi="Georgia" w:cs="Georgia"/>
-          <w:b/>
-          <w:i w:val="0"/>
-          <w:color w:val="222222"/>
-          <w:sz w:val="21"/>
-        </w:rPr>
-        <w:t>Stabby:</w:t>
-      </w:r>
-      <w:r>
-        <w:rPr>
-          <w:rFonts w:ascii="Georgia" w:hAnsi="Georgia" w:cs="Georgia"/>
-          <w:b w:val="0"/>
-          <w:i w:val="0"/>
-          <w:color w:val="222222"/>
-          <w:sz w:val="21"/>
-        </w:rPr>
-        <w:t xml:space="preserve"> “Whoever they are, they are going to get a taste of my blade!”</w:t>
-      </w:r>
-    </w:p>
-    <w:p>
-      <w:pPr>
-        <w:keepNext/>
-        <w:spacing w:before="400" w:after="120"/>
-        <w:pBdr>
-          <w:bottom w:val="single" w:sz="6" w:space="4" w:color="B8860B"/>
-        </w:pBdr>
-      </w:pPr>
-      <w:r>
-        <w:rPr>
-          <w:rFonts w:ascii="Georgia" w:hAnsi="Georgia" w:cs="Georgia"/>
-          <w:b/>
-          <w:color w:val="B8860B"/>
-          <w:sz w:val="32"/>
-        </w:rPr>
-        <w:t>Part Five: The Lights of Havenmoor</w:t>
-      </w:r>
-    </w:p>
-    <w:p>
-      <w:pPr>
-        <w:spacing w:before="120" w:after="200"/>
-      </w:pPr>
-      <w:r>
-        <w:rPr>
-          <w:rFonts w:ascii="Georgia" w:hAnsi="Georgia" w:cs="Georgia"/>
-          <w:b w:val="0"/>
-          <w:i/>
-          <w:color w:val="222222"/>
-          <w:sz w:val="21"/>
-        </w:rPr>
-        <w:t>The storm broke behind them, and the path wound down from the cliffs toward the glow of a town that smelled like cookies.</w:t>
-      </w:r>
-    </w:p>
-    <w:p>
-      <w:pPr>
-        <w:pBdr>
-          <w:left w:val="single" w:sz="18" w:space="12" w:color="B8860B"/>
-        </w:pBdr>
-        <w:shd w:val="clear" w:color="auto" w:fill="FBF6EA"/>
-        <w:spacing w:before="30" w:after="70"/>
-        <w:ind w:left="340" w:right="340"/>
-      </w:pPr>
-      <w:r>
-        <w:rPr>
-          <w:rFonts w:ascii="Georgia" w:hAnsi="Georgia" w:cs="Georgia"/>
-          <w:b w:val="0"/>
-          <w:i w:val="0"/>
-          <w:color w:val="222222"/>
-          <w:sz w:val="21"/>
-        </w:rPr>
-        <w:t>As the party descends, the roar of the sea softens, and new sounds drift up to meet them: distant laughter, jingling bells, a thread of festive music. The path becomes a cobblestone road flanked by frost-dusted pines, and the cold air fills with the mingled scents of sea salt, pine needles, cinnamon, nutmeg, and fresh-baked cookies.</w:t>
-      </w:r>
-    </w:p>
-    <w:p>
-      <w:pPr>
-        <w:pBdr>
-          <w:left w:val="single" w:sz="18" w:space="12" w:color="B8860B"/>
-        </w:pBdr>
-        <w:shd w:val="clear" w:color="auto" w:fill="FBF6EA"/>
-        <w:spacing w:before="30" w:after="70"/>
-        <w:ind w:left="340" w:right="340"/>
-      </w:pPr>
-      <w:r>
-        <w:rPr>
-          <w:rFonts w:ascii="Georgia" w:hAnsi="Georgia" w:cs="Georgia"/>
-          <w:b w:val="0"/>
-          <w:i w:val="0"/>
-          <w:color w:val="222222"/>
-          <w:sz w:val="21"/>
-        </w:rPr>
-        <w:t xml:space="preserve">Ahead at dusk lies </w:t>
-      </w:r>
-      <w:r>
-        <w:rPr>
-          <w:rFonts w:ascii="Georgia" w:hAnsi="Georgia" w:cs="Georgia"/>
-          <w:b/>
-          <w:i w:val="0"/>
-          <w:color w:val="222222"/>
-          <w:sz w:val="21"/>
-        </w:rPr>
-        <w:t>Havenmoor</w:t>
-      </w:r>
-      <w:r>
-        <w:rPr>
-          <w:rFonts w:ascii="Georgia" w:hAnsi="Georgia" w:cs="Georgia"/>
-          <w:b w:val="0"/>
-          <w:i w:val="0"/>
-          <w:color w:val="222222"/>
-          <w:sz w:val="21"/>
-        </w:rPr>
-        <w:t xml:space="preserve">, a coastal town sprung whole from a holiday fairytale. Stone and timber houses wear wreaths and garlands and twinkling lights. Red ribbons wrap the lamp posts, snow dusts the rooftops, and warm hearth-glow spills out of every window onto the cobbles. In the town square towers the </w:t>
-      </w:r>
-      <w:r>
-        <w:rPr>
-          <w:rFonts w:ascii="Georgia" w:hAnsi="Georgia" w:cs="Georgia"/>
-          <w:b/>
-          <w:i w:val="0"/>
-          <w:color w:val="222222"/>
-          <w:sz w:val="21"/>
-        </w:rPr>
-        <w:t>Great Pine of Havenmoor</w:t>
-      </w:r>
-      <w:r>
-        <w:rPr>
-          <w:rFonts w:ascii="Georgia" w:hAnsi="Georgia" w:cs="Georgia"/>
-          <w:b w:val="0"/>
-          <w:i w:val="0"/>
-          <w:color w:val="222222"/>
-          <w:sz w:val="21"/>
-        </w:rPr>
-        <w:t xml:space="preserve">, its branches heavy with glass baubles and shimmering ribbons, enchanted lights flickering among the boughs, a golden star burning at its top. Children pelt each other with snowballs beneath it. A painted signpost reads: </w:t>
-      </w:r>
-      <w:r>
-        <w:rPr>
-          <w:rFonts w:ascii="Georgia" w:hAnsi="Georgia" w:cs="Georgia"/>
-          <w:b w:val="0"/>
-          <w:i/>
-          <w:color w:val="222222"/>
-          <w:sz w:val="21"/>
-        </w:rPr>
-        <w:t>Welcome to Havenmoor! May your hearts be warm and your spirits bright!</w:t>
+        <w:t>, named for the iron-hard roots that twist through the earth like veins of metal. The higher the party climbs, the stranger the hills grow: bulbous mushrooms sprout between the rocks, their caps glowing with eerie blue-green light, until the whole hillside shines like a dream having a dream.</w:t>
       </w:r>
     </w:p>
     <w:p>
@@ -3731,7 +2800,7 @@
       <w:r>
         <w:drawing>
           <wp:inline xmlns:a="http://schemas.openxmlformats.org/drawingml/2006/main" xmlns:pic="http://schemas.openxmlformats.org/drawingml/2006/picture">
-            <wp:extent cx="3840480" cy="3840480"/>
+            <wp:extent cx="2377440" cy="2377440"/>
             <wp:docPr id="11" name="Picture 11"/>
             <wp:cNvGraphicFramePr>
               <a:graphicFrameLocks noChangeAspect="1"/>
@@ -3745,6 +2814,1105 @@
                   </pic:nvPicPr>
                   <pic:blipFill>
                     <a:blip r:embed="rId20"/>
+                    <a:stretch>
+                      <a:fillRect/>
+                    </a:stretch>
+                  </pic:blipFill>
+                  <pic:spPr>
+                    <a:xfrm>
+                      <a:off x="0" y="0"/>
+                      <a:ext cx="2377440" cy="2377440"/>
+                    </a:xfrm>
+                    <a:prstGeom prst="rect"/>
+                  </pic:spPr>
+                </pic:pic>
+              </a:graphicData>
+            </a:graphic>
+          </wp:inline>
+        </w:drawing>
+      </w:r>
+    </w:p>
+    <w:p>
+      <w:pPr>
+        <w:spacing w:after="140"/>
+        <w:jc w:val="center"/>
+      </w:pPr>
+      <w:r>
+        <w:rPr>
+          <w:rFonts w:ascii="Georgia" w:hAnsi="Georgia" w:cs="Georgia"/>
+          <w:i/>
+          <w:color w:val="888888"/>
+          <w:sz w:val="18"/>
+        </w:rPr>
+        <w:t>The approach into the Ironroot Hills, every rise crowned with glowing caps.</w:t>
+      </w:r>
+    </w:p>
+    <w:p>
+      <w:pPr>
+        <w:pBdr>
+          <w:left w:val="single" w:sz="18" w:space="12" w:color="5B2A86"/>
+        </w:pBdr>
+        <w:shd w:val="clear" w:color="auto" w:fill="F4F0FA"/>
+        <w:spacing w:before="30" w:after="70"/>
+        <w:ind w:left="340" w:right="340"/>
+      </w:pPr>
+      <w:r>
+        <w:rPr>
+          <w:rFonts w:ascii="Georgia" w:hAnsi="Georgia" w:cs="Georgia"/>
+          <w:b w:val="0"/>
+          <w:i w:val="0"/>
+          <w:color w:val="222222"/>
+          <w:sz w:val="19"/>
+        </w:rPr>
+        <w:t>▶ Wisdom (Perception) DC 14: the ground pulses faintly; the roots shift. Intelligence (Arcana) DC 15: the mushrooms are suffused with Feywild energy, reacting to the party's presence.</w:t>
+      </w:r>
+    </w:p>
+    <w:p>
+      <w:pPr>
+        <w:pBdr>
+          <w:left w:val="single" w:sz="18" w:space="12" w:color="B8860B"/>
+        </w:pBdr>
+        <w:shd w:val="clear" w:color="auto" w:fill="FBF6EA"/>
+        <w:spacing w:before="30" w:after="70"/>
+        <w:ind w:left="340" w:right="340"/>
+      </w:pPr>
+      <w:r>
+        <w:rPr>
+          <w:rFonts w:ascii="Georgia" w:hAnsi="Georgia" w:cs="Georgia"/>
+          <w:b/>
+          <w:i w:val="0"/>
+          <w:color w:val="222222"/>
+          <w:sz w:val="21"/>
+        </w:rPr>
+        <w:t>Lilly</w:t>
+      </w:r>
+      <w:r>
+        <w:rPr>
+          <w:rFonts w:ascii="Georgia" w:hAnsi="Georgia" w:cs="Georgia"/>
+          <w:b w:val="0"/>
+          <w:i w:val="0"/>
+          <w:color w:val="222222"/>
+          <w:sz w:val="21"/>
+        </w:rPr>
+        <w:t xml:space="preserve">, adjusting her goggles: “These mushrooms are not just glowing. They are responding to us. Be ready for anything.” </w:t>
+      </w:r>
+      <w:r>
+        <w:rPr>
+          <w:rFonts w:ascii="Georgia" w:hAnsi="Georgia" w:cs="Georgia"/>
+          <w:b/>
+          <w:i w:val="0"/>
+          <w:color w:val="222222"/>
+          <w:sz w:val="21"/>
+        </w:rPr>
+        <w:t>Stabby</w:t>
+      </w:r>
+      <w:r>
+        <w:rPr>
+          <w:rFonts w:ascii="Georgia" w:hAnsi="Georgia" w:cs="Georgia"/>
+          <w:b w:val="0"/>
+          <w:i w:val="0"/>
+          <w:color w:val="222222"/>
+          <w:sz w:val="21"/>
+        </w:rPr>
+        <w:t>, twirling his sword: “Living mushrooms? Bet they are not ready for a good stabbing.”</w:t>
+      </w:r>
+    </w:p>
+    <w:p>
+      <w:pPr>
+        <w:pBdr>
+          <w:left w:val="single" w:sz="18" w:space="12" w:color="B8860B"/>
+        </w:pBdr>
+        <w:shd w:val="clear" w:color="auto" w:fill="FBF6EA"/>
+        <w:spacing w:before="30" w:after="70"/>
+        <w:ind w:left="340" w:right="340"/>
+      </w:pPr>
+      <w:r>
+        <w:rPr>
+          <w:rFonts w:ascii="Georgia" w:hAnsi="Georgia" w:cs="Georgia"/>
+          <w:b w:val="0"/>
+          <w:i w:val="0"/>
+          <w:color w:val="222222"/>
+          <w:sz w:val="21"/>
+        </w:rPr>
+        <w:t xml:space="preserve">The moment the party steps into a clearing ringed with glowing caps, the ground shudders. With a series of wet, tearing sounds, four </w:t>
+      </w:r>
+      <w:r>
+        <w:rPr>
+          <w:rFonts w:ascii="Georgia" w:hAnsi="Georgia" w:cs="Georgia"/>
+          <w:b/>
+          <w:i w:val="0"/>
+          <w:color w:val="222222"/>
+          <w:sz w:val="21"/>
+        </w:rPr>
+        <w:t>Shroomytes</w:t>
+      </w:r>
+      <w:r>
+        <w:rPr>
+          <w:rFonts w:ascii="Georgia" w:hAnsi="Georgia" w:cs="Georgia"/>
+          <w:b w:val="0"/>
+          <w:i w:val="0"/>
+          <w:color w:val="222222"/>
+          <w:sz w:val="21"/>
+        </w:rPr>
+        <w:t xml:space="preserve"> pull themselves free of the soil, squat fungal bodies pulsing with inner light, tendrils of mycelium writhing like grasping fingers. A melodic hum rises from them, beautiful and menacing at once.</w:t>
+      </w:r>
+    </w:p>
+    <w:p>
+      <w:pPr>
+        <w:pBdr>
+          <w:left w:val="single" w:sz="18" w:space="12" w:color="B8860B"/>
+        </w:pBdr>
+        <w:shd w:val="clear" w:color="auto" w:fill="FBF6EA"/>
+        <w:spacing w:before="30" w:after="70"/>
+        <w:ind w:left="340" w:right="340"/>
+      </w:pPr>
+      <w:r>
+        <w:rPr>
+          <w:rFonts w:ascii="Georgia" w:hAnsi="Georgia" w:cs="Georgia"/>
+          <w:b/>
+          <w:i w:val="0"/>
+          <w:color w:val="222222"/>
+          <w:sz w:val="21"/>
+        </w:rPr>
+        <w:t>Shroomyte</w:t>
+      </w:r>
+      <w:r>
+        <w:rPr>
+          <w:rFonts w:ascii="Georgia" w:hAnsi="Georgia" w:cs="Georgia"/>
+          <w:b w:val="0"/>
+          <w:i w:val="0"/>
+          <w:color w:val="222222"/>
+          <w:sz w:val="21"/>
+        </w:rPr>
+        <w:t>, in a vibrating, musical tone: “Intruders... the grove... must be protected!”</w:t>
+      </w:r>
+    </w:p>
+    <w:p>
+      <w:pPr>
+        <w:keepNext/>
+        <w:spacing w:before="120" w:after="40"/>
+        <w:jc w:val="center"/>
+      </w:pPr>
+      <w:r>
+        <w:drawing>
+          <wp:inline xmlns:a="http://schemas.openxmlformats.org/drawingml/2006/main" xmlns:pic="http://schemas.openxmlformats.org/drawingml/2006/picture">
+            <wp:extent cx="3474720" cy="3474720"/>
+            <wp:docPr id="12" name="Picture 12"/>
+            <wp:cNvGraphicFramePr>
+              <a:graphicFrameLocks noChangeAspect="1"/>
+            </wp:cNvGraphicFramePr>
+            <a:graphic>
+              <a:graphicData uri="http://schemas.openxmlformats.org/drawingml/2006/picture">
+                <pic:pic>
+                  <pic:nvPicPr>
+                    <pic:cNvPr id="0" name="image.jpg"/>
+                    <pic:cNvPicPr/>
+                  </pic:nvPicPr>
+                  <pic:blipFill>
+                    <a:blip r:embed="rId21"/>
+                    <a:stretch>
+                      <a:fillRect/>
+                    </a:stretch>
+                  </pic:blipFill>
+                  <pic:spPr>
+                    <a:xfrm>
+                      <a:off x="0" y="0"/>
+                      <a:ext cx="3474720" cy="3474720"/>
+                    </a:xfrm>
+                    <a:prstGeom prst="rect"/>
+                  </pic:spPr>
+                </pic:pic>
+              </a:graphicData>
+            </a:graphic>
+          </wp:inline>
+        </w:drawing>
+      </w:r>
+    </w:p>
+    <w:p>
+      <w:pPr>
+        <w:spacing w:after="140"/>
+        <w:jc w:val="center"/>
+      </w:pPr>
+      <w:r>
+        <w:rPr>
+          <w:rFonts w:ascii="Georgia" w:hAnsi="Georgia" w:cs="Georgia"/>
+          <w:i/>
+          <w:color w:val="888888"/>
+          <w:sz w:val="18"/>
+        </w:rPr>
+        <w:t>The Shroomytes rise from the glowing grove of the Ironroot Hills.</w:t>
+      </w:r>
+    </w:p>
+    <w:p>
+      <w:pPr>
+        <w:pBdr>
+          <w:left w:val="single" w:sz="18" w:space="12" w:color="5B2A86"/>
+        </w:pBdr>
+        <w:shd w:val="clear" w:color="auto" w:fill="F4F0FA"/>
+        <w:spacing w:before="30" w:after="70"/>
+        <w:ind w:left="340" w:right="340"/>
+      </w:pPr>
+      <w:r>
+        <w:rPr>
+          <w:rFonts w:ascii="Georgia" w:hAnsi="Georgia" w:cs="Georgia"/>
+          <w:b w:val="0"/>
+          <w:i w:val="0"/>
+          <w:color w:val="222222"/>
+          <w:sz w:val="19"/>
+        </w:rPr>
+        <w:t xml:space="preserve">▶ </w:t>
+      </w:r>
+      <w:r>
+        <w:rPr>
+          <w:rFonts w:ascii="Georgia" w:hAnsi="Georgia" w:cs="Georgia"/>
+          <w:b/>
+          <w:i w:val="0"/>
+          <w:color w:val="222222"/>
+          <w:sz w:val="19"/>
+        </w:rPr>
+        <w:t>The fight.</w:t>
+      </w:r>
+      <w:r>
+        <w:rPr>
+          <w:rFonts w:ascii="Georgia" w:hAnsi="Georgia" w:cs="Georgia"/>
+          <w:b w:val="0"/>
+          <w:i w:val="0"/>
+          <w:color w:val="222222"/>
+          <w:sz w:val="19"/>
+        </w:rPr>
+        <w:t xml:space="preserve"> Four Shroomytes, CR 2 each (appendix). Spore Blasts from range, Mycelium Tendrils to entangle, difficult terrain everywhere. Lilly's fire found their weakness; Stabby simply refused to be caught.</w:t>
+      </w:r>
+    </w:p>
+    <w:p>
+      <w:pPr>
+        <w:pBdr>
+          <w:left w:val="single" w:sz="18" w:space="12" w:color="B8860B"/>
+        </w:pBdr>
+        <w:shd w:val="clear" w:color="auto" w:fill="FBF6EA"/>
+        <w:spacing w:before="30" w:after="70"/>
+        <w:ind w:left="340" w:right="340"/>
+      </w:pPr>
+      <w:r>
+        <w:rPr>
+          <w:rFonts w:ascii="Georgia" w:hAnsi="Georgia" w:cs="Georgia"/>
+          <w:b w:val="0"/>
+          <w:i w:val="0"/>
+          <w:color w:val="222222"/>
+          <w:sz w:val="21"/>
+        </w:rPr>
+        <w:t xml:space="preserve">It is a strange, glowing battle among the toadstools, and when the last Shroomyte folds gently back into the earth, the air fills with drifting, luminous spores, falling like warm snow. In the center of the clearing hovers a </w:t>
+      </w:r>
+      <w:r>
+        <w:rPr>
+          <w:rFonts w:ascii="Georgia" w:hAnsi="Georgia" w:cs="Georgia"/>
+          <w:b/>
+          <w:i w:val="0"/>
+          <w:color w:val="222222"/>
+          <w:sz w:val="21"/>
+        </w:rPr>
+        <w:t>Fungal Mote</w:t>
+      </w:r>
+      <w:r>
+        <w:rPr>
+          <w:rFonts w:ascii="Georgia" w:hAnsi="Georgia" w:cs="Georgia"/>
+          <w:b w:val="0"/>
+          <w:i w:val="0"/>
+          <w:color w:val="222222"/>
+          <w:sz w:val="21"/>
+        </w:rPr>
+        <w:t>, pulsing with otherworldly light.</w:t>
+      </w:r>
+    </w:p>
+    <w:p>
+      <w:pPr>
+        <w:pBdr>
+          <w:left w:val="single" w:sz="18" w:space="12" w:color="B8860B"/>
+        </w:pBdr>
+        <w:shd w:val="clear" w:color="auto" w:fill="FBF6EA"/>
+        <w:spacing w:before="30" w:after="70"/>
+        <w:ind w:left="340" w:right="340"/>
+      </w:pPr>
+      <w:r>
+        <w:rPr>
+          <w:rFonts w:ascii="Georgia" w:hAnsi="Georgia" w:cs="Georgia"/>
+          <w:b/>
+          <w:i w:val="0"/>
+          <w:color w:val="222222"/>
+          <w:sz w:val="21"/>
+        </w:rPr>
+        <w:t>Ursa</w:t>
+      </w:r>
+      <w:r>
+        <w:rPr>
+          <w:rFonts w:ascii="Georgia" w:hAnsi="Georgia" w:cs="Georgia"/>
+          <w:b w:val="0"/>
+          <w:i w:val="0"/>
+          <w:color w:val="222222"/>
+          <w:sz w:val="21"/>
+        </w:rPr>
+        <w:t>, reaching toward it, its glow reflected in his eyes: “This one feels like the Feywild, bleeding into our world.” The Essence Sphere in Lilly's pack hums in quiet agreement. The collection grows, and so does the mystery.</w:t>
+      </w:r>
+    </w:p>
+    <w:p>
+      <w:pPr>
+        <w:keepNext/>
+        <w:spacing w:before="400" w:after="120"/>
+        <w:pBdr>
+          <w:bottom w:val="single" w:sz="6" w:space="4" w:color="B8860B"/>
+        </w:pBdr>
+      </w:pPr>
+      <w:r>
+        <w:rPr>
+          <w:rFonts w:ascii="Georgia" w:hAnsi="Georgia" w:cs="Georgia"/>
+          <w:b/>
+          <w:color w:val="B8860B"/>
+          <w:sz w:val="32"/>
+        </w:rPr>
+        <w:t>Part Four: Stormwatch Cliffs</w:t>
+      </w:r>
+    </w:p>
+    <w:p>
+      <w:pPr>
+        <w:spacing w:before="120" w:after="200"/>
+      </w:pPr>
+      <w:r>
+        <w:rPr>
+          <w:rFonts w:ascii="Georgia" w:hAnsi="Georgia" w:cs="Georgia"/>
+          <w:b w:val="0"/>
+          <w:i/>
+          <w:color w:val="222222"/>
+          <w:sz w:val="21"/>
+        </w:rPr>
+        <w:t>By the time the hills gave way to open sky, the party could hear the sea, and the storm that lived above it.</w:t>
+      </w:r>
+    </w:p>
+    <w:p>
+      <w:pPr>
+        <w:pBdr>
+          <w:left w:val="single" w:sz="18" w:space="12" w:color="B8860B"/>
+        </w:pBdr>
+        <w:shd w:val="clear" w:color="auto" w:fill="FBF6EA"/>
+        <w:spacing w:before="30" w:after="70"/>
+        <w:ind w:left="340" w:right="340"/>
+      </w:pPr>
+      <w:r>
+        <w:rPr>
+          <w:rFonts w:ascii="Georgia" w:hAnsi="Georgia" w:cs="Georgia"/>
+          <w:b/>
+          <w:i w:val="0"/>
+          <w:color w:val="222222"/>
+          <w:sz w:val="21"/>
+        </w:rPr>
+        <w:t>Stormwatch Cliffs</w:t>
+      </w:r>
+      <w:r>
+        <w:rPr>
+          <w:rFonts w:ascii="Georgia" w:hAnsi="Georgia" w:cs="Georgia"/>
+          <w:b w:val="0"/>
+          <w:i w:val="0"/>
+          <w:color w:val="222222"/>
+          <w:sz w:val="21"/>
+        </w:rPr>
+        <w:t xml:space="preserve"> rise at the edge of the world: jagged stone ramparts above crashing waves, crowned with black clouds that flicker and grumble with lightning that never quite rests. The air crackles against the skin, tasting of salt and thunder. Etched into the rocks along the clifftop, strange runes glow with a pale blue light, brightening with every distant strike.</w:t>
+      </w:r>
+    </w:p>
+    <w:p>
+      <w:pPr>
+        <w:keepNext/>
+        <w:spacing w:before="220" w:after="60"/>
+      </w:pPr>
+      <w:r>
+        <w:rPr>
+          <w:rFonts w:ascii="Georgia" w:hAnsi="Georgia" w:cs="Georgia"/>
+          <w:b/>
+          <w:color w:val="A0522D"/>
+          <w:sz w:val="26"/>
+        </w:rPr>
+        <w:t>The Cliff Path</w:t>
+      </w:r>
+    </w:p>
+    <w:p>
+      <w:pPr>
+        <w:pBdr>
+          <w:left w:val="single" w:sz="18" w:space="12" w:color="B8860B"/>
+        </w:pBdr>
+        <w:shd w:val="clear" w:color="auto" w:fill="FBF6EA"/>
+        <w:spacing w:before="30" w:after="70"/>
+        <w:ind w:left="340" w:right="340"/>
+      </w:pPr>
+      <w:r>
+        <w:rPr>
+          <w:rFonts w:ascii="Georgia" w:hAnsi="Georgia" w:cs="Georgia"/>
+          <w:b w:val="0"/>
+          <w:i w:val="0"/>
+          <w:color w:val="222222"/>
+          <w:sz w:val="21"/>
+        </w:rPr>
+        <w:t>The only way forward is a narrow path snaking along the cliff's edge, with sheer drops to the hungry ocean below. The wind shoves like a rude giant. Stone crumbles where stone should hold. The Guardians rope together, watch each other's feet, and inch along the ledge while the storm booms overhead.</w:t>
+      </w:r>
+    </w:p>
+    <w:p>
+      <w:pPr>
+        <w:pBdr>
+          <w:left w:val="single" w:sz="18" w:space="12" w:color="5B2A86"/>
+        </w:pBdr>
+        <w:shd w:val="clear" w:color="auto" w:fill="F4F0FA"/>
+        <w:spacing w:before="30" w:after="70"/>
+        <w:ind w:left="340" w:right="340"/>
+      </w:pPr>
+      <w:r>
+        <w:rPr>
+          <w:rFonts w:ascii="Georgia" w:hAnsi="Georgia" w:cs="Georgia"/>
+          <w:b w:val="0"/>
+          <w:i w:val="0"/>
+          <w:color w:val="222222"/>
+          <w:sz w:val="19"/>
+        </w:rPr>
+        <w:t>▶ Skill challenge: Dexterity (Acrobatics) DC 14 on the narrow ledge; Wisdom (Perception) DC 15 to spot the crumbling section before it fell; Intelligence (Arcana) DC 15 to recognize the runes as an ancient magical defense, knowledge that pays off at the monolith. Falls dealt bruises (1d6 to 2d6), not tragedies.</w:t>
+      </w:r>
+    </w:p>
+    <w:p>
+      <w:pPr>
+        <w:keepNext/>
+        <w:spacing w:before="220" w:after="60"/>
+      </w:pPr>
+      <w:r>
+        <w:rPr>
+          <w:rFonts w:ascii="Georgia" w:hAnsi="Georgia" w:cs="Georgia"/>
+          <w:b/>
+          <w:color w:val="A0522D"/>
+          <w:sz w:val="26"/>
+        </w:rPr>
+        <w:t>The Monolith of Four Elements</w:t>
+      </w:r>
+    </w:p>
+    <w:p>
+      <w:pPr>
+        <w:pBdr>
+          <w:left w:val="single" w:sz="18" w:space="12" w:color="B8860B"/>
+        </w:pBdr>
+        <w:shd w:val="clear" w:color="auto" w:fill="FBF6EA"/>
+        <w:spacing w:before="30" w:after="70"/>
+        <w:ind w:left="340" w:right="340"/>
+      </w:pPr>
+      <w:r>
+        <w:rPr>
+          <w:rFonts w:ascii="Georgia" w:hAnsi="Georgia" w:cs="Georgia"/>
+          <w:b w:val="0"/>
+          <w:i w:val="0"/>
+          <w:color w:val="222222"/>
+          <w:sz w:val="21"/>
+        </w:rPr>
+        <w:t xml:space="preserve">Past the worst of the ledge, the path opens onto a circular stone platform carved into the cliffside. At its center stands a </w:t>
+      </w:r>
+      <w:r>
+        <w:rPr>
+          <w:rFonts w:ascii="Georgia" w:hAnsi="Georgia" w:cs="Georgia"/>
+          <w:b/>
+          <w:i w:val="0"/>
+          <w:color w:val="222222"/>
+          <w:sz w:val="21"/>
+        </w:rPr>
+        <w:t>monolith</w:t>
+      </w:r>
+      <w:r>
+        <w:rPr>
+          <w:rFonts w:ascii="Georgia" w:hAnsi="Georgia" w:cs="Georgia"/>
+          <w:b w:val="0"/>
+          <w:i w:val="0"/>
+          <w:color w:val="222222"/>
+          <w:sz w:val="21"/>
+        </w:rPr>
+        <w:t xml:space="preserve">, etched with the same runes as the cliffs, a lightning rod jutting from its peak. Every few minutes the storm reaches down and strikes the rod, and the whole platform glows. Around the monolith stand four smaller pedestals, each crowned with a rotating stone ring of symbols: </w:t>
+      </w:r>
+      <w:r>
+        <w:rPr>
+          <w:rFonts w:ascii="Georgia" w:hAnsi="Georgia" w:cs="Georgia"/>
+          <w:b/>
+          <w:i w:val="0"/>
+          <w:color w:val="222222"/>
+          <w:sz w:val="21"/>
+        </w:rPr>
+        <w:t>Air</w:t>
+      </w:r>
+      <w:r>
+        <w:rPr>
+          <w:rFonts w:ascii="Georgia" w:hAnsi="Georgia" w:cs="Georgia"/>
+          <w:b w:val="0"/>
+          <w:i w:val="0"/>
+          <w:color w:val="222222"/>
+          <w:sz w:val="21"/>
+        </w:rPr>
+        <w:t xml:space="preserve">, </w:t>
+      </w:r>
+      <w:r>
+        <w:rPr>
+          <w:rFonts w:ascii="Georgia" w:hAnsi="Georgia" w:cs="Georgia"/>
+          <w:b/>
+          <w:i w:val="0"/>
+          <w:color w:val="222222"/>
+          <w:sz w:val="21"/>
+        </w:rPr>
+        <w:t>Water</w:t>
+      </w:r>
+      <w:r>
+        <w:rPr>
+          <w:rFonts w:ascii="Georgia" w:hAnsi="Georgia" w:cs="Georgia"/>
+          <w:b w:val="0"/>
+          <w:i w:val="0"/>
+          <w:color w:val="222222"/>
+          <w:sz w:val="21"/>
+        </w:rPr>
+        <w:t xml:space="preserve">, </w:t>
+      </w:r>
+      <w:r>
+        <w:rPr>
+          <w:rFonts w:ascii="Georgia" w:hAnsi="Georgia" w:cs="Georgia"/>
+          <w:b/>
+          <w:i w:val="0"/>
+          <w:color w:val="222222"/>
+          <w:sz w:val="21"/>
+        </w:rPr>
+        <w:t>Earth</w:t>
+      </w:r>
+      <w:r>
+        <w:rPr>
+          <w:rFonts w:ascii="Georgia" w:hAnsi="Georgia" w:cs="Georgia"/>
+          <w:b w:val="0"/>
+          <w:i w:val="0"/>
+          <w:color w:val="222222"/>
+          <w:sz w:val="21"/>
+        </w:rPr>
+        <w:t xml:space="preserve">, and </w:t>
+      </w:r>
+      <w:r>
+        <w:rPr>
+          <w:rFonts w:ascii="Georgia" w:hAnsi="Georgia" w:cs="Georgia"/>
+          <w:b/>
+          <w:i w:val="0"/>
+          <w:color w:val="222222"/>
+          <w:sz w:val="21"/>
+        </w:rPr>
+        <w:t>Fire</w:t>
+      </w:r>
+      <w:r>
+        <w:rPr>
+          <w:rFonts w:ascii="Georgia" w:hAnsi="Georgia" w:cs="Georgia"/>
+          <w:b w:val="0"/>
+          <w:i w:val="0"/>
+          <w:color w:val="222222"/>
+          <w:sz w:val="21"/>
+        </w:rPr>
+        <w:t>.</w:t>
+      </w:r>
+    </w:p>
+    <w:p>
+      <w:pPr>
+        <w:pBdr>
+          <w:left w:val="single" w:sz="18" w:space="12" w:color="B8860B"/>
+        </w:pBdr>
+        <w:shd w:val="clear" w:color="auto" w:fill="FBF6EA"/>
+        <w:spacing w:before="30" w:after="70"/>
+        <w:ind w:left="340" w:right="340"/>
+      </w:pPr>
+      <w:r>
+        <w:rPr>
+          <w:rFonts w:ascii="Georgia" w:hAnsi="Georgia" w:cs="Georgia"/>
+          <w:b w:val="0"/>
+          <w:i w:val="0"/>
+          <w:color w:val="222222"/>
+          <w:sz w:val="21"/>
+        </w:rPr>
+        <w:t xml:space="preserve">Etched into the monolith's base, half-worn by centuries of storms, four phrases: </w:t>
+      </w:r>
+      <w:r>
+        <w:rPr>
+          <w:rFonts w:ascii="Georgia" w:hAnsi="Georgia" w:cs="Georgia"/>
+          <w:b w:val="0"/>
+          <w:i/>
+          <w:color w:val="222222"/>
+          <w:sz w:val="21"/>
+        </w:rPr>
+        <w:t>The winds whisper first. The tide rises after. Stone stands firm next. Flame seals the fate.</w:t>
+      </w:r>
+    </w:p>
+    <w:p>
+      <w:pPr>
+        <w:pBdr>
+          <w:left w:val="single" w:sz="18" w:space="12" w:color="5B2A86"/>
+        </w:pBdr>
+        <w:shd w:val="clear" w:color="auto" w:fill="F4F0FA"/>
+        <w:spacing w:before="30" w:after="70"/>
+        <w:ind w:left="340" w:right="340"/>
+      </w:pPr>
+      <w:r>
+        <w:rPr>
+          <w:rFonts w:ascii="Georgia" w:hAnsi="Georgia" w:cs="Georgia"/>
+          <w:b w:val="0"/>
+          <w:i w:val="0"/>
+          <w:color w:val="222222"/>
+          <w:sz w:val="19"/>
+        </w:rPr>
+        <w:t>▶ The puzzle: align the pedestals Air, then Water, then Earth, then Fire, timed to a lightning strike. Intelligence (Investigation) or Wisdom (Insight) DC 15 to read the sequence from the clues; a wrong alignment discharged 2d6 lightning. The party solved it on the storm's next breath.</w:t>
+      </w:r>
+    </w:p>
+    <w:p>
+      <w:pPr>
+        <w:pBdr>
+          <w:left w:val="single" w:sz="18" w:space="12" w:color="B8860B"/>
+        </w:pBdr>
+        <w:shd w:val="clear" w:color="auto" w:fill="FBF6EA"/>
+        <w:spacing w:before="30" w:after="70"/>
+        <w:ind w:left="340" w:right="340"/>
+      </w:pPr>
+      <w:r>
+        <w:rPr>
+          <w:rFonts w:ascii="Georgia" w:hAnsi="Georgia" w:cs="Georgia"/>
+          <w:b w:val="0"/>
+          <w:i w:val="0"/>
+          <w:color w:val="222222"/>
+          <w:sz w:val="21"/>
+        </w:rPr>
+        <w:t>Stone rings grind into place: wind, tide, stone, flame. The storm inhales. Lightning hammers the rod, and this time the monolith drinks it, humming louder and louder until a beam of pure light lances up into the clouds and blooms into a shimmering curtain of energy above the platform.</w:t>
+      </w:r>
+    </w:p>
+    <w:p>
+      <w:pPr>
+        <w:keepNext/>
+        <w:spacing w:before="120" w:after="40"/>
+        <w:jc w:val="center"/>
+      </w:pPr>
+      <w:r>
+        <w:drawing>
+          <wp:inline xmlns:a="http://schemas.openxmlformats.org/drawingml/2006/main" xmlns:pic="http://schemas.openxmlformats.org/drawingml/2006/picture">
+            <wp:extent cx="3840480" cy="3840480"/>
+            <wp:docPr id="13" name="Picture 13"/>
+            <wp:cNvGraphicFramePr>
+              <a:graphicFrameLocks noChangeAspect="1"/>
+            </wp:cNvGraphicFramePr>
+            <a:graphic>
+              <a:graphicData uri="http://schemas.openxmlformats.org/drawingml/2006/picture">
+                <pic:pic>
+                  <pic:nvPicPr>
+                    <pic:cNvPr id="0" name="image.jpg"/>
+                    <pic:cNvPicPr/>
+                  </pic:nvPicPr>
+                  <pic:blipFill>
+                    <a:blip r:embed="rId22"/>
+                    <a:stretch>
+                      <a:fillRect/>
+                    </a:stretch>
+                  </pic:blipFill>
+                  <pic:spPr>
+                    <a:xfrm>
+                      <a:off x="0" y="0"/>
+                      <a:ext cx="3840480" cy="3840480"/>
+                    </a:xfrm>
+                    <a:prstGeom prst="rect"/>
+                  </pic:spPr>
+                </pic:pic>
+              </a:graphicData>
+            </a:graphic>
+          </wp:inline>
+        </w:drawing>
+      </w:r>
+    </w:p>
+    <w:p>
+      <w:pPr>
+        <w:spacing w:after="140"/>
+        <w:jc w:val="center"/>
+      </w:pPr>
+      <w:r>
+        <w:rPr>
+          <w:rFonts w:ascii="Georgia" w:hAnsi="Georgia" w:cs="Georgia"/>
+          <w:i/>
+          <w:color w:val="888888"/>
+          <w:sz w:val="18"/>
+        </w:rPr>
+        <w:t>The Dark Figure looms over the monoliths of the Stormwatch Cliffs.</w:t>
+      </w:r>
+    </w:p>
+    <w:p>
+      <w:pPr>
+        <w:keepNext/>
+        <w:spacing w:before="220" w:after="60"/>
+      </w:pPr>
+      <w:r>
+        <w:rPr>
+          <w:rFonts w:ascii="Georgia" w:hAnsi="Georgia" w:cs="Georgia"/>
+          <w:b/>
+          <w:color w:val="A0522D"/>
+          <w:sz w:val="26"/>
+        </w:rPr>
+        <w:t>The Dark Figure</w:t>
+      </w:r>
+    </w:p>
+    <w:p>
+      <w:pPr>
+        <w:pBdr>
+          <w:left w:val="single" w:sz="18" w:space="12" w:color="B8860B"/>
+        </w:pBdr>
+        <w:shd w:val="clear" w:color="auto" w:fill="FBF6EA"/>
+        <w:spacing w:before="30" w:after="70"/>
+        <w:ind w:left="340" w:right="340"/>
+      </w:pPr>
+      <w:r>
+        <w:rPr>
+          <w:rFonts w:ascii="Georgia" w:hAnsi="Georgia" w:cs="Georgia"/>
+          <w:b w:val="0"/>
+          <w:i w:val="0"/>
+          <w:color w:val="222222"/>
+          <w:sz w:val="21"/>
+        </w:rPr>
+        <w:t>Within the curtain of light, a vision takes shape: a towering figure cloaked in darkness, its face hidden, its presence pressing down on the platform like a cold hand. The storm itself seems to lean away from it. When it speaks, the voice does not come through the air. It arrives directly inside their minds.</w:t>
+      </w:r>
+    </w:p>
+    <w:p>
+      <w:pPr>
+        <w:pBdr>
+          <w:left w:val="single" w:sz="18" w:space="12" w:color="B8860B"/>
+        </w:pBdr>
+        <w:shd w:val="clear" w:color="auto" w:fill="FBF6EA"/>
+        <w:spacing w:before="30" w:after="70"/>
+        <w:ind w:left="340" w:right="340"/>
+      </w:pPr>
+      <w:r>
+        <w:rPr>
+          <w:rFonts w:ascii="Georgia" w:hAnsi="Georgia" w:cs="Georgia"/>
+          <w:b/>
+          <w:i w:val="0"/>
+          <w:color w:val="222222"/>
+          <w:sz w:val="21"/>
+        </w:rPr>
+        <w:t>The dark figure:</w:t>
+      </w:r>
+      <w:r>
+        <w:rPr>
+          <w:rFonts w:ascii="Georgia" w:hAnsi="Georgia" w:cs="Georgia"/>
+          <w:b w:val="0"/>
+          <w:i w:val="0"/>
+          <w:color w:val="222222"/>
+          <w:sz w:val="21"/>
+        </w:rPr>
+        <w:t xml:space="preserve"> “You meddle with forces beyond your comprehension. The boundaries between realms are mine to shatter and shape. The goddess's light fades, and chaos will reign. The motes you gather are but embers of a dying flame. You cannot stop the unraveling.”</w:t>
+      </w:r>
+    </w:p>
+    <w:p>
+      <w:pPr>
+        <w:pBdr>
+          <w:left w:val="single" w:sz="18" w:space="12" w:color="B8860B"/>
+        </w:pBdr>
+        <w:shd w:val="clear" w:color="auto" w:fill="FBF6EA"/>
+        <w:spacing w:before="30" w:after="70"/>
+        <w:ind w:left="340" w:right="340"/>
+      </w:pPr>
+      <w:r>
+        <w:rPr>
+          <w:rFonts w:ascii="Georgia" w:hAnsi="Georgia" w:cs="Georgia"/>
+          <w:b w:val="0"/>
+          <w:i w:val="0"/>
+          <w:color w:val="222222"/>
+          <w:sz w:val="21"/>
+        </w:rPr>
+        <w:t xml:space="preserve">The vision collapses into darkness, and the light curtain blows out like a candle. Where it stood, something small falls to the stone with a crystalline chime: a </w:t>
+      </w:r>
+      <w:r>
+        <w:rPr>
+          <w:rFonts w:ascii="Georgia" w:hAnsi="Georgia" w:cs="Georgia"/>
+          <w:b/>
+          <w:i w:val="0"/>
+          <w:color w:val="222222"/>
+          <w:sz w:val="21"/>
+        </w:rPr>
+        <w:t>Dark Fragment</w:t>
+      </w:r>
+      <w:r>
+        <w:rPr>
+          <w:rFonts w:ascii="Georgia" w:hAnsi="Georgia" w:cs="Georgia"/>
+          <w:b w:val="0"/>
+          <w:i w:val="0"/>
+          <w:color w:val="222222"/>
+          <w:sz w:val="21"/>
+        </w:rPr>
+        <w:t>, a shard of crystallized energy swirling with elemental chaos, cold to the touch and heavier than it looks.</w:t>
+      </w:r>
+    </w:p>
+    <w:p>
+      <w:pPr>
+        <w:pBdr>
+          <w:left w:val="single" w:sz="18" w:space="12" w:color="5B2A86"/>
+        </w:pBdr>
+        <w:shd w:val="clear" w:color="auto" w:fill="F4F0FA"/>
+        <w:spacing w:before="30" w:after="70"/>
+        <w:ind w:left="340" w:right="340"/>
+      </w:pPr>
+      <w:r>
+        <w:rPr>
+          <w:rFonts w:ascii="Georgia" w:hAnsi="Georgia" w:cs="Georgia"/>
+          <w:b w:val="0"/>
+          <w:i w:val="0"/>
+          <w:color w:val="222222"/>
+          <w:sz w:val="19"/>
+        </w:rPr>
+        <w:t>▶ Intelligence (Arcana) DC 15: the fragment is a remnant of the same power corrupting the planar boundaries, tied directly to the weakening of Elaria. The party keeps it, carefully wrapped.</w:t>
+      </w:r>
+    </w:p>
+    <w:p>
+      <w:pPr>
+        <w:pBdr>
+          <w:left w:val="single" w:sz="18" w:space="12" w:color="B8860B"/>
+        </w:pBdr>
+        <w:shd w:val="clear" w:color="auto" w:fill="FBF6EA"/>
+        <w:spacing w:before="30" w:after="70"/>
+        <w:ind w:left="340" w:right="340"/>
+      </w:pPr>
+      <w:r>
+        <w:rPr>
+          <w:rFonts w:ascii="Georgia" w:hAnsi="Georgia" w:cs="Georgia"/>
+          <w:b w:val="0"/>
+          <w:i w:val="0"/>
+          <w:color w:val="222222"/>
+          <w:sz w:val="21"/>
+        </w:rPr>
+        <w:t xml:space="preserve">Until this moment, the breaking of the world might have been an accident: a storm, a sickness, a slow unlucky fraying. No longer. Someone stood in that light and called the boundaries </w:t>
+      </w:r>
+      <w:r>
+        <w:rPr>
+          <w:rFonts w:ascii="Georgia" w:hAnsi="Georgia" w:cs="Georgia"/>
+          <w:b w:val="0"/>
+          <w:i/>
+          <w:color w:val="222222"/>
+          <w:sz w:val="21"/>
+        </w:rPr>
+        <w:t>mine</w:t>
+      </w:r>
+      <w:r>
+        <w:rPr>
+          <w:rFonts w:ascii="Georgia" w:hAnsi="Georgia" w:cs="Georgia"/>
+          <w:b w:val="0"/>
+          <w:i w:val="0"/>
+          <w:color w:val="222222"/>
+          <w:sz w:val="21"/>
+        </w:rPr>
+        <w:t>. Someone is doing this on purpose.</w:t>
+      </w:r>
+    </w:p>
+    <w:p>
+      <w:pPr>
+        <w:pBdr>
+          <w:left w:val="single" w:sz="18" w:space="12" w:color="B8860B"/>
+        </w:pBdr>
+        <w:shd w:val="clear" w:color="auto" w:fill="FBF6EA"/>
+        <w:spacing w:before="30" w:after="70"/>
+        <w:ind w:left="340" w:right="340"/>
+      </w:pPr>
+      <w:r>
+        <w:rPr>
+          <w:rFonts w:ascii="Georgia" w:hAnsi="Georgia" w:cs="Georgia"/>
+          <w:b/>
+          <w:i w:val="0"/>
+          <w:color w:val="222222"/>
+          <w:sz w:val="21"/>
+        </w:rPr>
+        <w:t>Ursa:</w:t>
+      </w:r>
+      <w:r>
+        <w:rPr>
+          <w:rFonts w:ascii="Georgia" w:hAnsi="Georgia" w:cs="Georgia"/>
+          <w:b w:val="0"/>
+          <w:i w:val="0"/>
+          <w:color w:val="222222"/>
+          <w:sz w:val="21"/>
+        </w:rPr>
+        <w:t xml:space="preserve"> “That figure... they want to unravel everything. We have to stop them.” </w:t>
+      </w:r>
+      <w:r>
+        <w:rPr>
+          <w:rFonts w:ascii="Georgia" w:hAnsi="Georgia" w:cs="Georgia"/>
+          <w:b/>
+          <w:i w:val="0"/>
+          <w:color w:val="222222"/>
+          <w:sz w:val="21"/>
+        </w:rPr>
+        <w:t>Lilly:</w:t>
+      </w:r>
+      <w:r>
+        <w:rPr>
+          <w:rFonts w:ascii="Georgia" w:hAnsi="Georgia" w:cs="Georgia"/>
+          <w:b w:val="0"/>
+          <w:i w:val="0"/>
+          <w:color w:val="222222"/>
+          <w:sz w:val="21"/>
+        </w:rPr>
+        <w:t xml:space="preserve"> “The Artificer's Guild might be our best chance to figure this out, and to bring Pikachu back.” </w:t>
+      </w:r>
+      <w:r>
+        <w:rPr>
+          <w:rFonts w:ascii="Georgia" w:hAnsi="Georgia" w:cs="Georgia"/>
+          <w:b/>
+          <w:i w:val="0"/>
+          <w:color w:val="222222"/>
+          <w:sz w:val="21"/>
+        </w:rPr>
+        <w:t>Stabby:</w:t>
+      </w:r>
+      <w:r>
+        <w:rPr>
+          <w:rFonts w:ascii="Georgia" w:hAnsi="Georgia" w:cs="Georgia"/>
+          <w:b w:val="0"/>
+          <w:i w:val="0"/>
+          <w:color w:val="222222"/>
+          <w:sz w:val="21"/>
+        </w:rPr>
+        <w:t xml:space="preserve"> “Whoever they are, they are going to get a taste of my blade!”</w:t>
+      </w:r>
+    </w:p>
+    <w:p>
+      <w:pPr>
+        <w:keepNext/>
+        <w:spacing w:before="400" w:after="120"/>
+        <w:pBdr>
+          <w:bottom w:val="single" w:sz="6" w:space="4" w:color="B8860B"/>
+        </w:pBdr>
+      </w:pPr>
+      <w:r>
+        <w:rPr>
+          <w:rFonts w:ascii="Georgia" w:hAnsi="Georgia" w:cs="Georgia"/>
+          <w:b/>
+          <w:color w:val="B8860B"/>
+          <w:sz w:val="32"/>
+        </w:rPr>
+        <w:t>Part Five: The Lights of Havenmoor</w:t>
+      </w:r>
+    </w:p>
+    <w:p>
+      <w:pPr>
+        <w:spacing w:before="120" w:after="200"/>
+      </w:pPr>
+      <w:r>
+        <w:rPr>
+          <w:rFonts w:ascii="Georgia" w:hAnsi="Georgia" w:cs="Georgia"/>
+          <w:b w:val="0"/>
+          <w:i/>
+          <w:color w:val="222222"/>
+          <w:sz w:val="21"/>
+        </w:rPr>
+        <w:t>The storm broke behind them, and the path wound down from the cliffs toward the glow of a town that smelled like cookies.</w:t>
+      </w:r>
+    </w:p>
+    <w:p>
+      <w:pPr>
+        <w:pBdr>
+          <w:left w:val="single" w:sz="18" w:space="12" w:color="B8860B"/>
+        </w:pBdr>
+        <w:shd w:val="clear" w:color="auto" w:fill="FBF6EA"/>
+        <w:spacing w:before="30" w:after="70"/>
+        <w:ind w:left="340" w:right="340"/>
+      </w:pPr>
+      <w:r>
+        <w:rPr>
+          <w:rFonts w:ascii="Georgia" w:hAnsi="Georgia" w:cs="Georgia"/>
+          <w:b w:val="0"/>
+          <w:i w:val="0"/>
+          <w:color w:val="222222"/>
+          <w:sz w:val="21"/>
+        </w:rPr>
+        <w:t>As the party descends, the roar of the sea softens, and new sounds drift up to meet them: distant laughter, jingling bells, a thread of festive music. The path becomes a cobblestone road flanked by frost-dusted pines, and the cold air fills with the mingled scents of sea salt, pine needles, cinnamon, nutmeg, and fresh-baked cookies.</w:t>
+      </w:r>
+    </w:p>
+    <w:p>
+      <w:pPr>
+        <w:pBdr>
+          <w:left w:val="single" w:sz="18" w:space="12" w:color="B8860B"/>
+        </w:pBdr>
+        <w:shd w:val="clear" w:color="auto" w:fill="FBF6EA"/>
+        <w:spacing w:before="30" w:after="70"/>
+        <w:ind w:left="340" w:right="340"/>
+      </w:pPr>
+      <w:r>
+        <w:rPr>
+          <w:rFonts w:ascii="Georgia" w:hAnsi="Georgia" w:cs="Georgia"/>
+          <w:b w:val="0"/>
+          <w:i w:val="0"/>
+          <w:color w:val="222222"/>
+          <w:sz w:val="21"/>
+        </w:rPr>
+        <w:t xml:space="preserve">Ahead at dusk lies </w:t>
+      </w:r>
+      <w:r>
+        <w:rPr>
+          <w:rFonts w:ascii="Georgia" w:hAnsi="Georgia" w:cs="Georgia"/>
+          <w:b/>
+          <w:i w:val="0"/>
+          <w:color w:val="222222"/>
+          <w:sz w:val="21"/>
+        </w:rPr>
+        <w:t>Havenmoor</w:t>
+      </w:r>
+      <w:r>
+        <w:rPr>
+          <w:rFonts w:ascii="Georgia" w:hAnsi="Georgia" w:cs="Georgia"/>
+          <w:b w:val="0"/>
+          <w:i w:val="0"/>
+          <w:color w:val="222222"/>
+          <w:sz w:val="21"/>
+        </w:rPr>
+        <w:t xml:space="preserve">, a coastal town sprung whole from a holiday fairytale. Stone and timber houses wear wreaths and garlands and twinkling lights. Red ribbons wrap the lamp posts, snow dusts the rooftops, and warm hearth-glow spills out of every window onto the cobbles. In the town square towers the </w:t>
+      </w:r>
+      <w:r>
+        <w:rPr>
+          <w:rFonts w:ascii="Georgia" w:hAnsi="Georgia" w:cs="Georgia"/>
+          <w:b/>
+          <w:i w:val="0"/>
+          <w:color w:val="222222"/>
+          <w:sz w:val="21"/>
+        </w:rPr>
+        <w:t>Great Pine of Havenmoor</w:t>
+      </w:r>
+      <w:r>
+        <w:rPr>
+          <w:rFonts w:ascii="Georgia" w:hAnsi="Georgia" w:cs="Georgia"/>
+          <w:b w:val="0"/>
+          <w:i w:val="0"/>
+          <w:color w:val="222222"/>
+          <w:sz w:val="21"/>
+        </w:rPr>
+        <w:t xml:space="preserve">, its branches heavy with glass baubles and shimmering ribbons, enchanted lights flickering among the boughs, a golden star burning at its top. Children pelt each other with snowballs beneath it. A painted signpost reads: </w:t>
+      </w:r>
+      <w:r>
+        <w:rPr>
+          <w:rFonts w:ascii="Georgia" w:hAnsi="Georgia" w:cs="Georgia"/>
+          <w:b w:val="0"/>
+          <w:i/>
+          <w:color w:val="222222"/>
+          <w:sz w:val="21"/>
+        </w:rPr>
+        <w:t>Welcome to Havenmoor! May your hearts be warm and your spirits bright!</w:t>
+      </w:r>
+    </w:p>
+    <w:p>
+      <w:pPr>
+        <w:keepNext/>
+        <w:spacing w:before="120" w:after="40"/>
+        <w:jc w:val="center"/>
+      </w:pPr>
+      <w:r>
+        <w:drawing>
+          <wp:inline xmlns:a="http://schemas.openxmlformats.org/drawingml/2006/main" xmlns:pic="http://schemas.openxmlformats.org/drawingml/2006/picture">
+            <wp:extent cx="3840480" cy="3840480"/>
+            <wp:docPr id="14" name="Picture 14"/>
+            <wp:cNvGraphicFramePr>
+              <a:graphicFrameLocks noChangeAspect="1"/>
+            </wp:cNvGraphicFramePr>
+            <a:graphic>
+              <a:graphicData uri="http://schemas.openxmlformats.org/drawingml/2006/picture">
+                <pic:pic>
+                  <pic:nvPicPr>
+                    <pic:cNvPr id="0" name="image.jpg"/>
+                    <pic:cNvPicPr/>
+                  </pic:nvPicPr>
+                  <pic:blipFill>
+                    <a:blip r:embed="rId23"/>
                     <a:stretch>
                       <a:fillRect/>
                     </a:stretch>

</xml_diff>